<commit_message>
Add Session 2: data cleaning for ARENA project
</commit_message>
<xml_diff>
--- a/Data analysis of ARENA.docx
+++ b/Data analysis of ARENA.docx
@@ -255,7 +255,11 @@
         <w:t>Previewed the first 10 rows</w:t>
       </w:r>
       <w:r>
-        <w:t xml:space="preserve"> – Using </w:t>
+        <w:t xml:space="preserve"> – </w:t>
+      </w:r>
+      <w:proofErr w:type="gramStart"/>
+      <w:r>
+        <w:t xml:space="preserve">Using </w:t>
       </w:r>
       <w:r>
         <w:rPr>
@@ -271,7 +275,16 @@
           <w:sz w:val="20"/>
           <w:szCs w:val="20"/>
         </w:rPr>
-        <w:t>head(10)</w:t>
+        <w:t>head</w:t>
+      </w:r>
+      <w:proofErr w:type="gramEnd"/>
+      <w:r>
+        <w:rPr>
+          <w:rFonts w:ascii="Consolas" w:hAnsi="Consolas"/>
+          <w:sz w:val="20"/>
+          <w:szCs w:val="20"/>
+        </w:rPr>
+        <w:t>(10)</w:t>
       </w:r>
       <w:r>
         <w:t>, I reviewed the first 10 rows. I noticed several missing values and a mix of numeric and non-numeric columns.</w:t>
@@ -345,7 +358,23 @@
           <w:b/>
           <w:bCs/>
         </w:rPr>
-        <w:t xml:space="preserve"> a concise summary with .info()</w:t>
+        <w:t xml:space="preserve"> a concise summary with .</w:t>
+      </w:r>
+      <w:proofErr w:type="gramStart"/>
+      <w:r>
+        <w:rPr>
+          <w:b/>
+          <w:bCs/>
+        </w:rPr>
+        <w:t>info(</w:t>
+      </w:r>
+      <w:proofErr w:type="gramEnd"/>
+      <w:r>
+        <w:rPr>
+          <w:b/>
+          <w:bCs/>
+        </w:rPr>
+        <w:t>)</w:t>
       </w:r>
       <w:r>
         <w:t xml:space="preserve"> – Using </w:t>
@@ -356,7 +385,25 @@
           <w:sz w:val="20"/>
           <w:szCs w:val="20"/>
         </w:rPr>
-        <w:t>.info()</w:t>
+        <w:t>.</w:t>
+      </w:r>
+      <w:proofErr w:type="gramStart"/>
+      <w:r>
+        <w:rPr>
+          <w:rFonts w:ascii="Consolas" w:hAnsi="Consolas"/>
+          <w:sz w:val="20"/>
+          <w:szCs w:val="20"/>
+        </w:rPr>
+        <w:t>info(</w:t>
+      </w:r>
+      <w:proofErr w:type="gramEnd"/>
+      <w:r>
+        <w:rPr>
+          <w:rFonts w:ascii="Consolas" w:hAnsi="Consolas"/>
+          <w:sz w:val="20"/>
+          <w:szCs w:val="20"/>
+        </w:rPr>
+        <w:t>)</w:t>
       </w:r>
       <w:r>
         <w:t>, I reviewed all the columns their datatypes and the memory space of dataset.</w:t>
@@ -376,21 +423,50 @@
           <w:b/>
           <w:bCs/>
         </w:rPr>
-        <w:t xml:space="preserve">Created a statistical summary with .describe() </w:t>
+        <w:t xml:space="preserve">Created a statistical summary </w:t>
+      </w:r>
+      <w:proofErr w:type="gramStart"/>
+      <w:r>
+        <w:rPr>
+          <w:b/>
+          <w:bCs/>
+        </w:rPr>
+        <w:t>with .describe</w:t>
+      </w:r>
+      <w:proofErr w:type="gramEnd"/>
+      <w:r>
+        <w:rPr>
+          <w:b/>
+          <w:bCs/>
+        </w:rPr>
+        <w:t xml:space="preserve">() </w:t>
       </w:r>
       <w:r>
         <w:t>–</w:t>
       </w:r>
       <w:r>
-        <w:t xml:space="preserve"> Using </w:t>
-      </w:r>
-      <w:r>
-        <w:rPr>
-          <w:rFonts w:ascii="Consolas" w:hAnsi="Consolas"/>
-          <w:sz w:val="20"/>
-          <w:szCs w:val="20"/>
-        </w:rPr>
-        <w:t>.describe()</w:t>
+        <w:t xml:space="preserve"> </w:t>
+      </w:r>
+      <w:proofErr w:type="gramStart"/>
+      <w:r>
+        <w:t xml:space="preserve">Using </w:t>
+      </w:r>
+      <w:r>
+        <w:rPr>
+          <w:rFonts w:ascii="Consolas" w:hAnsi="Consolas"/>
+          <w:sz w:val="20"/>
+          <w:szCs w:val="20"/>
+        </w:rPr>
+        <w:t>.describe</w:t>
+      </w:r>
+      <w:proofErr w:type="gramEnd"/>
+      <w:r>
+        <w:rPr>
+          <w:rFonts w:ascii="Consolas" w:hAnsi="Consolas"/>
+          <w:sz w:val="20"/>
+          <w:szCs w:val="20"/>
+        </w:rPr>
+        <w:t>()</w:t>
       </w:r>
       <w:r>
         <w:t>, I reviewed all the statistical summary of numeric columns from the dataset. Functions includ</w:t>
@@ -399,7 +475,11 @@
         <w:t>ed</w:t>
       </w:r>
       <w:r>
-        <w:t xml:space="preserve"> in </w:t>
+        <w:t xml:space="preserve"> </w:t>
+      </w:r>
+      <w:proofErr w:type="gramStart"/>
+      <w:r>
+        <w:t xml:space="preserve">in </w:t>
       </w:r>
       <w:r>
         <w:rPr>
@@ -423,7 +503,16 @@
           <w:sz w:val="20"/>
           <w:szCs w:val="20"/>
         </w:rPr>
-        <w:t>cribe()</w:t>
+        <w:t>cribe</w:t>
+      </w:r>
+      <w:proofErr w:type="gramEnd"/>
+      <w:r>
+        <w:rPr>
+          <w:rFonts w:ascii="Consolas" w:hAnsi="Consolas"/>
+          <w:sz w:val="20"/>
+          <w:szCs w:val="20"/>
+        </w:rPr>
+        <w:t>()</w:t>
       </w:r>
       <w:r>
         <w:t xml:space="preserve"> are max, min, mean etc.</w:t>
@@ -453,7 +542,11 @@
         <w:t>ed the last 15 rows from dataset</w:t>
       </w:r>
       <w:r>
-        <w:t xml:space="preserve"> – I reviewed the last 15 rows of dataset by using </w:t>
+        <w:t xml:space="preserve"> – I reviewed the last 15 rows of dataset by </w:t>
+      </w:r>
+      <w:proofErr w:type="gramStart"/>
+      <w:r>
+        <w:t xml:space="preserve">using </w:t>
       </w:r>
       <w:r>
         <w:rPr>
@@ -463,6 +556,7 @@
         </w:rPr>
         <w:t>.tail</w:t>
       </w:r>
+      <w:proofErr w:type="gramEnd"/>
       <w:r>
         <w:rPr>
           <w:rFonts w:ascii="Consolas" w:hAnsi="Consolas"/>
@@ -532,9 +626,11 @@
       <w:r>
         <w:t xml:space="preserve"> – I checked the number of numeric columns including ‘float64’ and ‘int64’ datatype columns. There </w:t>
       </w:r>
+      <w:proofErr w:type="gramStart"/>
       <w:r>
         <w:t>were</w:t>
       </w:r>
+      <w:proofErr w:type="gramEnd"/>
       <w:r>
         <w:t xml:space="preserve"> total 15 of them that are numeric other 13 </w:t>
       </w:r>
@@ -577,16 +673,44 @@
           <w:sz w:val="20"/>
           <w:szCs w:val="20"/>
         </w:rPr>
-        <w:t>gaming_data.isna</w:t>
-      </w:r>
-      <w:proofErr w:type="spellEnd"/>
-      <w:r>
-        <w:rPr>
-          <w:rFonts w:ascii="Consolas" w:hAnsi="Consolas"/>
-          <w:sz w:val="20"/>
-          <w:szCs w:val="20"/>
-        </w:rPr>
-        <w:t>().any()</w:t>
+        <w:t>gaming_</w:t>
+      </w:r>
+      <w:proofErr w:type="gramStart"/>
+      <w:r>
+        <w:rPr>
+          <w:rFonts w:ascii="Consolas" w:hAnsi="Consolas"/>
+          <w:sz w:val="20"/>
+          <w:szCs w:val="20"/>
+        </w:rPr>
+        <w:t>data.isna</w:t>
+      </w:r>
+      <w:proofErr w:type="spellEnd"/>
+      <w:proofErr w:type="gramEnd"/>
+      <w:r>
+        <w:rPr>
+          <w:rFonts w:ascii="Consolas" w:hAnsi="Consolas"/>
+          <w:sz w:val="20"/>
+          <w:szCs w:val="20"/>
+        </w:rPr>
+        <w:t>(</w:t>
+      </w:r>
+      <w:proofErr w:type="gramStart"/>
+      <w:r>
+        <w:rPr>
+          <w:rFonts w:ascii="Consolas" w:hAnsi="Consolas"/>
+          <w:sz w:val="20"/>
+          <w:szCs w:val="20"/>
+        </w:rPr>
+        <w:t>).any</w:t>
+      </w:r>
+      <w:proofErr w:type="gramEnd"/>
+      <w:r>
+        <w:rPr>
+          <w:rFonts w:ascii="Consolas" w:hAnsi="Consolas"/>
+          <w:sz w:val="20"/>
+          <w:szCs w:val="20"/>
+        </w:rPr>
+        <w:t>()</w:t>
       </w:r>
       <w:r>
         <w:rPr>
@@ -613,10 +737,26 @@
           <w:b/>
           <w:bCs/>
         </w:rPr>
-        <w:t>Calculate the dataset memory usage</w:t>
-      </w:r>
-      <w:r>
-        <w:t xml:space="preserve">  – By using </w:t>
+        <w:t xml:space="preserve">Calculate the dataset memory </w:t>
+      </w:r>
+      <w:proofErr w:type="gramStart"/>
+      <w:r>
+        <w:rPr>
+          <w:b/>
+          <w:bCs/>
+        </w:rPr>
+        <w:t>usage</w:t>
+      </w:r>
+      <w:r>
+        <w:t xml:space="preserve">  –</w:t>
+      </w:r>
+      <w:proofErr w:type="gramEnd"/>
+      <w:r>
+        <w:t xml:space="preserve"> By </w:t>
+      </w:r>
+      <w:proofErr w:type="gramStart"/>
+      <w:r>
+        <w:t xml:space="preserve">using </w:t>
       </w:r>
       <w:r>
         <w:rPr>
@@ -633,16 +773,43 @@
           <w:sz w:val="20"/>
           <w:szCs w:val="20"/>
         </w:rPr>
-        <w:t>memory_usage</w:t>
-      </w:r>
-      <w:proofErr w:type="spellEnd"/>
-      <w:r>
-        <w:rPr>
-          <w:rFonts w:ascii="Consolas" w:hAnsi="Consolas"/>
-          <w:sz w:val="20"/>
-          <w:szCs w:val="20"/>
-        </w:rPr>
-        <w:t>()</w:t>
+        <w:t>memory</w:t>
+      </w:r>
+      <w:proofErr w:type="gramEnd"/>
+      <w:r>
+        <w:rPr>
+          <w:rFonts w:ascii="Consolas" w:hAnsi="Consolas"/>
+          <w:sz w:val="20"/>
+          <w:szCs w:val="20"/>
+        </w:rPr>
+        <w:t>_</w:t>
+      </w:r>
+      <w:proofErr w:type="gramStart"/>
+      <w:r>
+        <w:rPr>
+          <w:rFonts w:ascii="Consolas" w:hAnsi="Consolas"/>
+          <w:sz w:val="20"/>
+          <w:szCs w:val="20"/>
+        </w:rPr>
+        <w:t>usage</w:t>
+      </w:r>
+      <w:proofErr w:type="spellEnd"/>
+      <w:r>
+        <w:rPr>
+          <w:rFonts w:ascii="Consolas" w:hAnsi="Consolas"/>
+          <w:sz w:val="20"/>
+          <w:szCs w:val="20"/>
+        </w:rPr>
+        <w:t>(</w:t>
+      </w:r>
+      <w:proofErr w:type="gramEnd"/>
+      <w:r>
+        <w:rPr>
+          <w:rFonts w:ascii="Consolas" w:hAnsi="Consolas"/>
+          <w:sz w:val="20"/>
+          <w:szCs w:val="20"/>
+        </w:rPr>
+        <w:t>)</w:t>
       </w:r>
       <w:r>
         <w:t xml:space="preserve"> function I </w:t>
@@ -671,7 +838,11 @@
         <w:t>Found the column with the most unique value</w:t>
       </w:r>
       <w:r>
-        <w:t xml:space="preserve"> – I created a variable to store the name of most unique column. To do this I applied the </w:t>
+        <w:t xml:space="preserve"> – I created a variable to store the name of most unique column. To do this I applied </w:t>
+      </w:r>
+      <w:proofErr w:type="gramStart"/>
+      <w:r>
+        <w:t xml:space="preserve">the </w:t>
       </w:r>
       <w:r>
         <w:rPr>
@@ -688,7 +859,16 @@
           <w:sz w:val="20"/>
           <w:szCs w:val="20"/>
         </w:rPr>
-        <w:t>sort_value</w:t>
+        <w:t>sort</w:t>
+      </w:r>
+      <w:proofErr w:type="gramEnd"/>
+      <w:r>
+        <w:rPr>
+          <w:rFonts w:ascii="Consolas" w:hAnsi="Consolas"/>
+          <w:sz w:val="20"/>
+          <w:szCs w:val="20"/>
+        </w:rPr>
+        <w:t>_value</w:t>
       </w:r>
       <w:r>
         <w:rPr>
@@ -711,6 +891,7 @@
         <w:t xml:space="preserve"> on the </w:t>
       </w:r>
       <w:proofErr w:type="spellStart"/>
+      <w:proofErr w:type="gramStart"/>
       <w:r>
         <w:rPr>
           <w:rFonts w:ascii="Consolas" w:hAnsi="Consolas"/>
@@ -726,7 +907,16 @@
           <w:sz w:val="20"/>
           <w:szCs w:val="20"/>
         </w:rPr>
-        <w:t>()</w:t>
+        <w:t>(</w:t>
+      </w:r>
+      <w:proofErr w:type="gramEnd"/>
+      <w:r>
+        <w:rPr>
+          <w:rFonts w:ascii="Consolas" w:hAnsi="Consolas"/>
+          <w:sz w:val="20"/>
+          <w:szCs w:val="20"/>
+        </w:rPr>
+        <w:t>)</w:t>
       </w:r>
       <w:r>
         <w:rPr>
@@ -802,10 +992,12 @@
         <w:t>verified_account</w:t>
       </w:r>
       <w:proofErr w:type="spellEnd"/>
+      <w:proofErr w:type="gramStart"/>
       <w:r>
         <w:t>’,  ‘</w:t>
       </w:r>
       <w:proofErr w:type="spellStart"/>
+      <w:proofErr w:type="gramEnd"/>
       <w:r>
         <w:t>primary_platform</w:t>
       </w:r>
@@ -845,16 +1037,34 @@
           <w:b/>
           <w:bCs/>
         </w:rPr>
-        <w:t>value_counts</w:t>
-      </w:r>
-      <w:proofErr w:type="spellEnd"/>
-      <w:r>
-        <w:rPr>
-          <w:rFonts w:ascii="Consolas" w:hAnsi="Consolas"/>
-          <w:b/>
-          <w:bCs/>
-        </w:rPr>
-        <w:t>()</w:t>
+        <w:t>value_</w:t>
+      </w:r>
+      <w:proofErr w:type="gramStart"/>
+      <w:r>
+        <w:rPr>
+          <w:rFonts w:ascii="Consolas" w:hAnsi="Consolas"/>
+          <w:b/>
+          <w:bCs/>
+        </w:rPr>
+        <w:t>counts</w:t>
+      </w:r>
+      <w:proofErr w:type="spellEnd"/>
+      <w:r>
+        <w:rPr>
+          <w:rFonts w:ascii="Consolas" w:hAnsi="Consolas"/>
+          <w:b/>
+          <w:bCs/>
+        </w:rPr>
+        <w:t>(</w:t>
+      </w:r>
+      <w:proofErr w:type="gramEnd"/>
+      <w:r>
+        <w:rPr>
+          <w:rFonts w:ascii="Consolas" w:hAnsi="Consolas"/>
+          <w:b/>
+          <w:bCs/>
+        </w:rPr>
+        <w:t>)</w:t>
       </w:r>
       <w:r>
         <w:t xml:space="preserve"> – FPS is the most followed genre by communities, followed by Battle Royale, MOBA etc.</w:t>
@@ -894,6 +1104,2601 @@
       <w:r>
         <w:t xml:space="preserve"> we have 400 rows indexed sequentially.</w:t>
       </w:r>
+    </w:p>
+    <w:p>
+      <w:pPr>
+        <w:spacing w:line="276" w:lineRule="auto"/>
+        <w:rPr>
+          <w:b/>
+          <w:bCs/>
+          <w:sz w:val="28"/>
+          <w:szCs w:val="28"/>
+          <w:lang w:val="en-PK"/>
+        </w:rPr>
+      </w:pPr>
+      <w:r>
+        <w:rPr>
+          <w:b/>
+          <w:bCs/>
+          <w:sz w:val="28"/>
+          <w:szCs w:val="28"/>
+          <w:lang w:val="en-PK"/>
+        </w:rPr>
+        <w:t>Session 2 of EDA: Data Cleaning and Preprocessing</w:t>
+      </w:r>
+    </w:p>
+    <w:p>
+      <w:pPr>
+        <w:spacing w:line="276" w:lineRule="auto"/>
+        <w:rPr>
+          <w:lang w:val="en-PK"/>
+        </w:rPr>
+      </w:pPr>
+      <w:r>
+        <w:rPr>
+          <w:lang w:val="en-PK"/>
+        </w:rPr>
+        <w:t>In this session, I cleaned the gaming community dataset and made it ready for further analysis like grouping, aggregations, and visualizations.</w:t>
+      </w:r>
+    </w:p>
+    <w:p>
+      <w:pPr>
+        <w:numPr>
+          <w:ilvl w:val="0"/>
+          <w:numId w:val="4"/>
+        </w:numPr>
+        <w:spacing w:line="276" w:lineRule="auto"/>
+        <w:rPr>
+          <w:lang w:val="en-PK"/>
+        </w:rPr>
+      </w:pPr>
+      <w:r>
+        <w:rPr>
+          <w:b/>
+          <w:bCs/>
+          <w:lang w:val="en-PK"/>
+        </w:rPr>
+        <w:t>Imported essential libraries –</w:t>
+      </w:r>
+      <w:r>
+        <w:rPr>
+          <w:lang w:val="en-PK"/>
+        </w:rPr>
+        <w:t xml:space="preserve"> I started by importing </w:t>
+      </w:r>
+      <w:r>
+        <w:rPr>
+          <w:rFonts w:ascii="Consolas" w:hAnsi="Consolas"/>
+          <w:sz w:val="20"/>
+          <w:szCs w:val="20"/>
+          <w:lang w:val="en-PK"/>
+        </w:rPr>
+        <w:t>NumPy</w:t>
+      </w:r>
+      <w:r>
+        <w:rPr>
+          <w:lang w:val="en-PK"/>
+        </w:rPr>
+        <w:t xml:space="preserve"> and </w:t>
+      </w:r>
+      <w:r>
+        <w:rPr>
+          <w:rFonts w:ascii="Consolas" w:hAnsi="Consolas"/>
+          <w:sz w:val="20"/>
+          <w:szCs w:val="20"/>
+          <w:lang w:val="en-PK"/>
+        </w:rPr>
+        <w:t>Pandas</w:t>
+      </w:r>
+      <w:r>
+        <w:rPr>
+          <w:lang w:val="en-PK"/>
+        </w:rPr>
+        <w:t xml:space="preserve"> in the very first cell. This gave me all the tools I needed to clean the data.</w:t>
+      </w:r>
+    </w:p>
+    <w:p>
+      <w:pPr>
+        <w:numPr>
+          <w:ilvl w:val="0"/>
+          <w:numId w:val="4"/>
+        </w:numPr>
+        <w:spacing w:line="276" w:lineRule="auto"/>
+        <w:rPr>
+          <w:lang w:val="en-PK"/>
+        </w:rPr>
+      </w:pPr>
+      <w:r>
+        <w:rPr>
+          <w:b/>
+          <w:bCs/>
+          <w:lang w:val="en-PK"/>
+        </w:rPr>
+        <w:t>Loaded the dataset and made a copy to work on –</w:t>
+      </w:r>
+      <w:r>
+        <w:rPr>
+          <w:lang w:val="en-PK"/>
+        </w:rPr>
+        <w:t xml:space="preserve"> </w:t>
+      </w:r>
+      <w:proofErr w:type="gramStart"/>
+      <w:r>
+        <w:rPr>
+          <w:lang w:val="en-PK"/>
+        </w:rPr>
+        <w:t>Using </w:t>
+      </w:r>
+      <w:r>
+        <w:rPr>
+          <w:rFonts w:ascii="Consolas" w:hAnsi="Consolas"/>
+          <w:sz w:val="20"/>
+          <w:szCs w:val="20"/>
+          <w:lang w:val="en-PK"/>
+        </w:rPr>
+        <w:t>.</w:t>
+      </w:r>
+      <w:proofErr w:type="spellStart"/>
+      <w:r>
+        <w:rPr>
+          <w:rFonts w:ascii="Consolas" w:hAnsi="Consolas"/>
+          <w:sz w:val="20"/>
+          <w:szCs w:val="20"/>
+          <w:lang w:val="en-PK"/>
+        </w:rPr>
+        <w:t>read</w:t>
+      </w:r>
+      <w:proofErr w:type="gramEnd"/>
+      <w:r>
+        <w:rPr>
+          <w:rFonts w:ascii="Consolas" w:hAnsi="Consolas"/>
+          <w:sz w:val="20"/>
+          <w:szCs w:val="20"/>
+          <w:lang w:val="en-PK"/>
+        </w:rPr>
+        <w:t>_</w:t>
+      </w:r>
+      <w:proofErr w:type="gramStart"/>
+      <w:r>
+        <w:rPr>
+          <w:rFonts w:ascii="Consolas" w:hAnsi="Consolas"/>
+          <w:sz w:val="20"/>
+          <w:szCs w:val="20"/>
+          <w:lang w:val="en-PK"/>
+        </w:rPr>
+        <w:t>csv</w:t>
+      </w:r>
+      <w:proofErr w:type="spellEnd"/>
+      <w:r>
+        <w:rPr>
+          <w:rFonts w:ascii="Consolas" w:hAnsi="Consolas"/>
+          <w:sz w:val="20"/>
+          <w:szCs w:val="20"/>
+          <w:lang w:val="en-PK"/>
+        </w:rPr>
+        <w:t>(</w:t>
+      </w:r>
+      <w:proofErr w:type="gramEnd"/>
+      <w:r>
+        <w:rPr>
+          <w:rFonts w:ascii="Consolas" w:hAnsi="Consolas"/>
+          <w:sz w:val="20"/>
+          <w:szCs w:val="20"/>
+          <w:lang w:val="en-PK"/>
+        </w:rPr>
+        <w:t>)</w:t>
+      </w:r>
+      <w:r>
+        <w:rPr>
+          <w:lang w:val="en-PK"/>
+        </w:rPr>
+        <w:t xml:space="preserve">, I loaded the gaming </w:t>
+      </w:r>
+      <w:proofErr w:type="gramStart"/>
+      <w:r>
+        <w:rPr>
+          <w:lang w:val="en-PK"/>
+        </w:rPr>
+        <w:t>communities</w:t>
+      </w:r>
+      <w:proofErr w:type="gramEnd"/>
+      <w:r>
+        <w:rPr>
+          <w:lang w:val="en-PK"/>
+        </w:rPr>
+        <w:t xml:space="preserve"> dataset. Then I made a copy of that dataset so that cleaning wouldn’t affect the original.</w:t>
+      </w:r>
+    </w:p>
+    <w:p>
+      <w:pPr>
+        <w:numPr>
+          <w:ilvl w:val="0"/>
+          <w:numId w:val="4"/>
+        </w:numPr>
+        <w:spacing w:line="276" w:lineRule="auto"/>
+        <w:rPr>
+          <w:lang w:val="en-PK"/>
+        </w:rPr>
+      </w:pPr>
+      <w:r>
+        <w:rPr>
+          <w:b/>
+          <w:bCs/>
+          <w:lang w:val="en-PK"/>
+        </w:rPr>
+        <w:t>Found the columns with null values </w:t>
+      </w:r>
+      <w:r>
+        <w:rPr>
+          <w:lang w:val="en-PK"/>
+        </w:rPr>
+        <w:t xml:space="preserve">– </w:t>
+      </w:r>
+      <w:proofErr w:type="gramStart"/>
+      <w:r>
+        <w:rPr>
+          <w:lang w:val="en-PK"/>
+        </w:rPr>
+        <w:t>Using </w:t>
+      </w:r>
+      <w:r>
+        <w:rPr>
+          <w:rFonts w:ascii="Consolas" w:hAnsi="Consolas"/>
+          <w:sz w:val="18"/>
+          <w:szCs w:val="18"/>
+          <w:lang w:val="en-PK"/>
+        </w:rPr>
+        <w:t>.</w:t>
+      </w:r>
+      <w:proofErr w:type="spellStart"/>
+      <w:r>
+        <w:rPr>
+          <w:rFonts w:ascii="Consolas" w:hAnsi="Consolas"/>
+          <w:sz w:val="18"/>
+          <w:szCs w:val="18"/>
+          <w:lang w:val="en-PK"/>
+        </w:rPr>
+        <w:t>isna</w:t>
+      </w:r>
+      <w:proofErr w:type="spellEnd"/>
+      <w:proofErr w:type="gramEnd"/>
+      <w:r>
+        <w:rPr>
+          <w:rFonts w:ascii="Consolas" w:hAnsi="Consolas"/>
+          <w:sz w:val="18"/>
+          <w:szCs w:val="18"/>
+          <w:lang w:val="en-PK"/>
+        </w:rPr>
+        <w:t>(</w:t>
+      </w:r>
+      <w:proofErr w:type="gramStart"/>
+      <w:r>
+        <w:rPr>
+          <w:rFonts w:ascii="Consolas" w:hAnsi="Consolas"/>
+          <w:sz w:val="18"/>
+          <w:szCs w:val="18"/>
+          <w:lang w:val="en-PK"/>
+        </w:rPr>
+        <w:t>).sum</w:t>
+      </w:r>
+      <w:proofErr w:type="gramEnd"/>
+      <w:r>
+        <w:rPr>
+          <w:rFonts w:ascii="Consolas" w:hAnsi="Consolas"/>
+          <w:sz w:val="18"/>
+          <w:szCs w:val="18"/>
+          <w:lang w:val="en-PK"/>
+        </w:rPr>
+        <w:t>(</w:t>
+      </w:r>
+      <w:proofErr w:type="gramStart"/>
+      <w:r>
+        <w:rPr>
+          <w:rFonts w:ascii="Consolas" w:hAnsi="Consolas"/>
+          <w:sz w:val="18"/>
+          <w:szCs w:val="18"/>
+          <w:lang w:val="en-PK"/>
+        </w:rPr>
+        <w:t>).</w:t>
+      </w:r>
+      <w:proofErr w:type="spellStart"/>
+      <w:r>
+        <w:rPr>
+          <w:rFonts w:ascii="Consolas" w:hAnsi="Consolas"/>
+          <w:sz w:val="18"/>
+          <w:szCs w:val="18"/>
+          <w:lang w:val="en-PK"/>
+        </w:rPr>
+        <w:t>sort</w:t>
+      </w:r>
+      <w:proofErr w:type="gramEnd"/>
+      <w:r>
+        <w:rPr>
+          <w:rFonts w:ascii="Consolas" w:hAnsi="Consolas"/>
+          <w:sz w:val="18"/>
+          <w:szCs w:val="18"/>
+          <w:lang w:val="en-PK"/>
+        </w:rPr>
+        <w:t>_values</w:t>
+      </w:r>
+      <w:proofErr w:type="spellEnd"/>
+      <w:r>
+        <w:rPr>
+          <w:rFonts w:ascii="Consolas" w:hAnsi="Consolas"/>
+          <w:sz w:val="18"/>
+          <w:szCs w:val="18"/>
+          <w:lang w:val="en-PK"/>
+        </w:rPr>
+        <w:t>(ascending=False)</w:t>
+      </w:r>
+      <w:r>
+        <w:rPr>
+          <w:lang w:val="en-PK"/>
+        </w:rPr>
+        <w:t>, I identified the columns with the most null values: </w:t>
+      </w:r>
+      <w:proofErr w:type="spellStart"/>
+      <w:r>
+        <w:rPr>
+          <w:lang w:val="en-PK"/>
+        </w:rPr>
+        <w:t>twitch_stream_viewers_avg</w:t>
+      </w:r>
+      <w:proofErr w:type="spellEnd"/>
+      <w:r>
+        <w:rPr>
+          <w:lang w:val="en-PK"/>
+        </w:rPr>
+        <w:t> (302 nulls), followed by </w:t>
+      </w:r>
+      <w:proofErr w:type="spellStart"/>
+      <w:r>
+        <w:rPr>
+          <w:lang w:val="en-PK"/>
+        </w:rPr>
+        <w:t>monthly_revenue_usd</w:t>
+      </w:r>
+      <w:proofErr w:type="spellEnd"/>
+      <w:r>
+        <w:rPr>
+          <w:lang w:val="en-PK"/>
+        </w:rPr>
+        <w:t> (302 nulls), </w:t>
+      </w:r>
+      <w:proofErr w:type="spellStart"/>
+      <w:r>
+        <w:rPr>
+          <w:lang w:val="en-PK"/>
+        </w:rPr>
+        <w:t>win_rate_pct</w:t>
+      </w:r>
+      <w:proofErr w:type="spellEnd"/>
+      <w:r>
+        <w:rPr>
+          <w:lang w:val="en-PK"/>
+        </w:rPr>
+        <w:t> (288 nulls), and so on. The results were sorted in descending order.</w:t>
+      </w:r>
+    </w:p>
+    <w:p>
+      <w:pPr>
+        <w:numPr>
+          <w:ilvl w:val="0"/>
+          <w:numId w:val="4"/>
+        </w:numPr>
+        <w:spacing w:line="276" w:lineRule="auto"/>
+        <w:rPr>
+          <w:lang w:val="en-PK"/>
+        </w:rPr>
+      </w:pPr>
+      <w:r>
+        <w:rPr>
+          <w:b/>
+          <w:bCs/>
+          <w:lang w:val="en-PK"/>
+        </w:rPr>
+        <w:t>Dropped rows where </w:t>
+      </w:r>
+      <w:proofErr w:type="spellStart"/>
+      <w:r>
+        <w:rPr>
+          <w:b/>
+          <w:bCs/>
+          <w:lang w:val="en-PK"/>
+        </w:rPr>
+        <w:t>active_players</w:t>
+      </w:r>
+      <w:proofErr w:type="spellEnd"/>
+      <w:r>
+        <w:rPr>
+          <w:b/>
+          <w:bCs/>
+          <w:lang w:val="en-PK"/>
+        </w:rPr>
+        <w:t> were null –</w:t>
+      </w:r>
+      <w:r>
+        <w:rPr>
+          <w:lang w:val="en-PK"/>
+        </w:rPr>
+        <w:t xml:space="preserve"> </w:t>
+      </w:r>
+      <w:proofErr w:type="gramStart"/>
+      <w:r>
+        <w:rPr>
+          <w:lang w:val="en-PK"/>
+        </w:rPr>
+        <w:t>Using </w:t>
+      </w:r>
+      <w:r>
+        <w:rPr>
+          <w:rFonts w:ascii="Consolas" w:hAnsi="Consolas"/>
+          <w:sz w:val="20"/>
+          <w:szCs w:val="20"/>
+          <w:lang w:val="en-PK"/>
+        </w:rPr>
+        <w:t>.</w:t>
+      </w:r>
+      <w:proofErr w:type="spellStart"/>
+      <w:r>
+        <w:rPr>
+          <w:rFonts w:ascii="Consolas" w:hAnsi="Consolas"/>
+          <w:sz w:val="20"/>
+          <w:szCs w:val="20"/>
+          <w:lang w:val="en-PK"/>
+        </w:rPr>
+        <w:t>dropna</w:t>
+      </w:r>
+      <w:proofErr w:type="spellEnd"/>
+      <w:proofErr w:type="gramEnd"/>
+      <w:r>
+        <w:rPr>
+          <w:rFonts w:ascii="Consolas" w:hAnsi="Consolas"/>
+          <w:sz w:val="20"/>
+          <w:szCs w:val="20"/>
+          <w:lang w:val="en-PK"/>
+        </w:rPr>
+        <w:t>(),</w:t>
+      </w:r>
+      <w:r>
+        <w:rPr>
+          <w:sz w:val="20"/>
+          <w:szCs w:val="20"/>
+          <w:lang w:val="en-PK"/>
+        </w:rPr>
+        <w:t xml:space="preserve"> </w:t>
+      </w:r>
+      <w:r>
+        <w:rPr>
+          <w:lang w:val="en-PK"/>
+        </w:rPr>
+        <w:t>I removed all rows where active players were null. This reduced the number of rows from 400 to 357.</w:t>
+      </w:r>
+    </w:p>
+    <w:p>
+      <w:pPr>
+        <w:numPr>
+          <w:ilvl w:val="0"/>
+          <w:numId w:val="4"/>
+        </w:numPr>
+        <w:spacing w:line="276" w:lineRule="auto"/>
+        <w:rPr>
+          <w:lang w:val="en-PK"/>
+        </w:rPr>
+      </w:pPr>
+      <w:r>
+        <w:rPr>
+          <w:b/>
+          <w:bCs/>
+          <w:lang w:val="en-PK"/>
+        </w:rPr>
+        <w:t>Filled </w:t>
+      </w:r>
+      <w:proofErr w:type="spellStart"/>
+      <w:r>
+        <w:rPr>
+          <w:b/>
+          <w:bCs/>
+          <w:lang w:val="en-PK"/>
+        </w:rPr>
+        <w:t>avg_member_age</w:t>
+      </w:r>
+      <w:proofErr w:type="spellEnd"/>
+      <w:r>
+        <w:rPr>
+          <w:b/>
+          <w:bCs/>
+          <w:lang w:val="en-PK"/>
+        </w:rPr>
+        <w:t> with the median –</w:t>
+      </w:r>
+      <w:r>
+        <w:rPr>
+          <w:lang w:val="en-PK"/>
+        </w:rPr>
+        <w:t xml:space="preserve"> </w:t>
+      </w:r>
+      <w:proofErr w:type="gramStart"/>
+      <w:r>
+        <w:rPr>
+          <w:lang w:val="en-PK"/>
+        </w:rPr>
+        <w:t>Using </w:t>
+      </w:r>
+      <w:r>
+        <w:rPr>
+          <w:rFonts w:ascii="Consolas" w:hAnsi="Consolas"/>
+          <w:sz w:val="18"/>
+          <w:szCs w:val="18"/>
+          <w:lang w:val="en-PK"/>
+        </w:rPr>
+        <w:t>.</w:t>
+      </w:r>
+      <w:proofErr w:type="spellStart"/>
+      <w:r>
+        <w:rPr>
+          <w:rFonts w:ascii="Consolas" w:hAnsi="Consolas"/>
+          <w:sz w:val="18"/>
+          <w:szCs w:val="18"/>
+          <w:lang w:val="en-PK"/>
+        </w:rPr>
+        <w:t>fillna</w:t>
+      </w:r>
+      <w:proofErr w:type="spellEnd"/>
+      <w:proofErr w:type="gramEnd"/>
+      <w:r>
+        <w:rPr>
+          <w:rFonts w:ascii="Consolas" w:hAnsi="Consolas"/>
+          <w:sz w:val="18"/>
+          <w:szCs w:val="18"/>
+          <w:lang w:val="en-PK"/>
+        </w:rPr>
+        <w:t xml:space="preserve">(), </w:t>
+      </w:r>
+      <w:r>
+        <w:rPr>
+          <w:lang w:val="en-PK"/>
+        </w:rPr>
+        <w:t>I filled all null values in </w:t>
+      </w:r>
+      <w:proofErr w:type="spellStart"/>
+      <w:r>
+        <w:rPr>
+          <w:lang w:val="en-PK"/>
+        </w:rPr>
+        <w:t>avg_member_age</w:t>
+      </w:r>
+      <w:proofErr w:type="spellEnd"/>
+      <w:r>
+        <w:rPr>
+          <w:lang w:val="en-PK"/>
+        </w:rPr>
+        <w:t> with the median. This not only removed the nulls but also reduced the chance of outliers and anomalies.</w:t>
+      </w:r>
+    </w:p>
+    <w:p>
+      <w:pPr>
+        <w:numPr>
+          <w:ilvl w:val="0"/>
+          <w:numId w:val="4"/>
+        </w:numPr>
+        <w:spacing w:line="276" w:lineRule="auto"/>
+        <w:rPr>
+          <w:lang w:val="en-PK"/>
+        </w:rPr>
+      </w:pPr>
+      <w:r>
+        <w:rPr>
+          <w:b/>
+          <w:bCs/>
+          <w:lang w:val="en-PK"/>
+        </w:rPr>
+        <w:t>Filled </w:t>
+      </w:r>
+      <w:proofErr w:type="spellStart"/>
+      <w:r>
+        <w:rPr>
+          <w:b/>
+          <w:bCs/>
+          <w:lang w:val="en-PK"/>
+        </w:rPr>
+        <w:t>secondary_game</w:t>
+      </w:r>
+      <w:proofErr w:type="spellEnd"/>
+      <w:r>
+        <w:rPr>
+          <w:b/>
+          <w:bCs/>
+          <w:lang w:val="en-PK"/>
+        </w:rPr>
+        <w:t> with the string 'None' –</w:t>
+      </w:r>
+      <w:r>
+        <w:rPr>
+          <w:lang w:val="en-PK"/>
+        </w:rPr>
+        <w:t xml:space="preserve"> </w:t>
+      </w:r>
+      <w:proofErr w:type="gramStart"/>
+      <w:r>
+        <w:rPr>
+          <w:lang w:val="en-PK"/>
+        </w:rPr>
+        <w:t>Using </w:t>
+      </w:r>
+      <w:r>
+        <w:rPr>
+          <w:rFonts w:ascii="Consolas" w:hAnsi="Consolas"/>
+          <w:sz w:val="18"/>
+          <w:szCs w:val="18"/>
+          <w:lang w:val="en-PK"/>
+        </w:rPr>
+        <w:t>.</w:t>
+      </w:r>
+      <w:proofErr w:type="spellStart"/>
+      <w:r>
+        <w:rPr>
+          <w:rFonts w:ascii="Consolas" w:hAnsi="Consolas"/>
+          <w:sz w:val="18"/>
+          <w:szCs w:val="18"/>
+          <w:lang w:val="en-PK"/>
+        </w:rPr>
+        <w:t>fillna</w:t>
+      </w:r>
+      <w:proofErr w:type="spellEnd"/>
+      <w:proofErr w:type="gramEnd"/>
+      <w:r>
+        <w:rPr>
+          <w:rFonts w:ascii="Consolas" w:hAnsi="Consolas"/>
+          <w:sz w:val="18"/>
+          <w:szCs w:val="18"/>
+          <w:lang w:val="en-PK"/>
+        </w:rPr>
+        <w:t>(),</w:t>
+      </w:r>
+      <w:r>
+        <w:rPr>
+          <w:sz w:val="18"/>
+          <w:szCs w:val="18"/>
+          <w:lang w:val="en-PK"/>
+        </w:rPr>
+        <w:t xml:space="preserve"> </w:t>
+      </w:r>
+      <w:r>
+        <w:rPr>
+          <w:lang w:val="en-PK"/>
+        </w:rPr>
+        <w:t>I replaced null values in </w:t>
+      </w:r>
+      <w:proofErr w:type="spellStart"/>
+      <w:r>
+        <w:rPr>
+          <w:lang w:val="en-PK"/>
+        </w:rPr>
+        <w:t>secondary_game</w:t>
+      </w:r>
+      <w:proofErr w:type="spellEnd"/>
+      <w:r>
+        <w:rPr>
+          <w:lang w:val="en-PK"/>
+        </w:rPr>
+        <w:t> with the string 'None'. I chose 'None' because it is not compulsory for communities to have a secondary game.</w:t>
+      </w:r>
+    </w:p>
+    <w:p>
+      <w:pPr>
+        <w:numPr>
+          <w:ilvl w:val="0"/>
+          <w:numId w:val="4"/>
+        </w:numPr>
+        <w:spacing w:line="276" w:lineRule="auto"/>
+        <w:rPr>
+          <w:lang w:val="en-PK"/>
+        </w:rPr>
+      </w:pPr>
+      <w:r>
+        <w:rPr>
+          <w:b/>
+          <w:bCs/>
+          <w:lang w:val="en-PK"/>
+        </w:rPr>
+        <w:t>Dropped columns with more than 60% null values –</w:t>
+      </w:r>
+      <w:r>
+        <w:rPr>
+          <w:lang w:val="en-PK"/>
+        </w:rPr>
+        <w:t xml:space="preserve"> First, I calculated the null percentage per column. Then I created a Boolean mask to identify columns to drop, applied the 60% condition, and </w:t>
+      </w:r>
+      <w:proofErr w:type="gramStart"/>
+      <w:r>
+        <w:rPr>
+          <w:lang w:val="en-PK"/>
+        </w:rPr>
+        <w:t>used </w:t>
+      </w:r>
+      <w:r>
+        <w:rPr>
+          <w:rFonts w:ascii="Consolas" w:hAnsi="Consolas"/>
+          <w:sz w:val="18"/>
+          <w:szCs w:val="18"/>
+          <w:lang w:val="en-PK"/>
+        </w:rPr>
+        <w:t>.index</w:t>
+      </w:r>
+      <w:proofErr w:type="gramEnd"/>
+      <w:r>
+        <w:rPr>
+          <w:rFonts w:ascii="Consolas" w:hAnsi="Consolas"/>
+          <w:sz w:val="18"/>
+          <w:szCs w:val="18"/>
+          <w:lang w:val="en-PK"/>
+        </w:rPr>
+        <w:t> </w:t>
+      </w:r>
+      <w:r>
+        <w:rPr>
+          <w:lang w:val="en-PK"/>
+        </w:rPr>
+        <w:t>to get the column names. Finally, I dropped those columns permanently. This removed four columns: average_prize_pool_usd, twitch_stream_viewers_avg, win_rate_pct, and </w:t>
+      </w:r>
+      <w:proofErr w:type="spellStart"/>
+      <w:r>
+        <w:rPr>
+          <w:lang w:val="en-PK"/>
+        </w:rPr>
+        <w:t>monthly_revenue_usd</w:t>
+      </w:r>
+      <w:proofErr w:type="spellEnd"/>
+      <w:r>
+        <w:rPr>
+          <w:lang w:val="en-PK"/>
+        </w:rPr>
+        <w:t>.</w:t>
+      </w:r>
+    </w:p>
+    <w:p>
+      <w:pPr>
+        <w:numPr>
+          <w:ilvl w:val="0"/>
+          <w:numId w:val="4"/>
+        </w:numPr>
+        <w:spacing w:line="276" w:lineRule="auto"/>
+        <w:rPr>
+          <w:lang w:val="en-PK"/>
+        </w:rPr>
+      </w:pPr>
+      <w:r>
+        <w:rPr>
+          <w:b/>
+          <w:bCs/>
+          <w:lang w:val="en-PK"/>
+        </w:rPr>
+        <w:t>Filled null values in </w:t>
+      </w:r>
+      <w:proofErr w:type="spellStart"/>
+      <w:r>
+        <w:rPr>
+          <w:b/>
+          <w:bCs/>
+          <w:lang w:val="en-PK"/>
+        </w:rPr>
+        <w:t>year_founded</w:t>
+      </w:r>
+      <w:proofErr w:type="spellEnd"/>
+      <w:r>
+        <w:rPr>
+          <w:b/>
+          <w:bCs/>
+          <w:lang w:val="en-PK"/>
+        </w:rPr>
+        <w:t xml:space="preserve"> and changed its </w:t>
+      </w:r>
+      <w:proofErr w:type="spellStart"/>
+      <w:r>
+        <w:rPr>
+          <w:b/>
+          <w:bCs/>
+          <w:lang w:val="en-PK"/>
+        </w:rPr>
+        <w:t>dtype</w:t>
+      </w:r>
+      <w:proofErr w:type="spellEnd"/>
+      <w:r>
+        <w:rPr>
+          <w:b/>
+          <w:bCs/>
+          <w:lang w:val="en-PK"/>
+        </w:rPr>
+        <w:t> –</w:t>
+      </w:r>
+      <w:r>
+        <w:rPr>
+          <w:lang w:val="en-PK"/>
+        </w:rPr>
+        <w:t xml:space="preserve"> </w:t>
+      </w:r>
+      <w:proofErr w:type="gramStart"/>
+      <w:r>
+        <w:rPr>
+          <w:lang w:val="en-PK"/>
+        </w:rPr>
+        <w:t>Using </w:t>
+      </w:r>
+      <w:r>
+        <w:rPr>
+          <w:rFonts w:ascii="Consolas" w:hAnsi="Consolas"/>
+          <w:sz w:val="20"/>
+          <w:szCs w:val="20"/>
+          <w:lang w:val="en-PK"/>
+        </w:rPr>
+        <w:t>.</w:t>
+      </w:r>
+      <w:proofErr w:type="spellStart"/>
+      <w:r>
+        <w:rPr>
+          <w:rFonts w:ascii="Consolas" w:hAnsi="Consolas"/>
+          <w:sz w:val="20"/>
+          <w:szCs w:val="20"/>
+          <w:lang w:val="en-PK"/>
+        </w:rPr>
+        <w:t>ffill</w:t>
+      </w:r>
+      <w:proofErr w:type="spellEnd"/>
+      <w:proofErr w:type="gramEnd"/>
+      <w:r>
+        <w:rPr>
+          <w:rFonts w:ascii="Consolas" w:hAnsi="Consolas"/>
+          <w:sz w:val="20"/>
+          <w:szCs w:val="20"/>
+          <w:lang w:val="en-PK"/>
+        </w:rPr>
+        <w:t>()</w:t>
+      </w:r>
+      <w:r>
+        <w:rPr>
+          <w:lang w:val="en-PK"/>
+        </w:rPr>
+        <w:t> on the </w:t>
+      </w:r>
+      <w:proofErr w:type="spellStart"/>
+      <w:r>
+        <w:rPr>
+          <w:lang w:val="en-PK"/>
+        </w:rPr>
+        <w:t>year_founded</w:t>
+      </w:r>
+      <w:proofErr w:type="spellEnd"/>
+      <w:r>
+        <w:rPr>
+          <w:lang w:val="en-PK"/>
+        </w:rPr>
+        <w:t xml:space="preserve"> column, I filled the missing values. Because the data was in float64, I </w:t>
+      </w:r>
+      <w:proofErr w:type="gramStart"/>
+      <w:r>
+        <w:rPr>
+          <w:lang w:val="en-PK"/>
+        </w:rPr>
+        <w:t>used </w:t>
+      </w:r>
+      <w:r>
+        <w:rPr>
+          <w:rFonts w:ascii="Consolas" w:hAnsi="Consolas"/>
+          <w:sz w:val="18"/>
+          <w:szCs w:val="18"/>
+          <w:lang w:val="en-PK"/>
+        </w:rPr>
+        <w:t>.</w:t>
+      </w:r>
+      <w:proofErr w:type="spellStart"/>
+      <w:r>
+        <w:rPr>
+          <w:rFonts w:ascii="Consolas" w:hAnsi="Consolas"/>
+          <w:sz w:val="18"/>
+          <w:szCs w:val="18"/>
+          <w:lang w:val="en-PK"/>
+        </w:rPr>
+        <w:t>astype</w:t>
+      </w:r>
+      <w:proofErr w:type="spellEnd"/>
+      <w:proofErr w:type="gramEnd"/>
+      <w:r>
+        <w:rPr>
+          <w:rFonts w:ascii="Consolas" w:hAnsi="Consolas"/>
+          <w:sz w:val="18"/>
+          <w:szCs w:val="18"/>
+          <w:lang w:val="en-PK"/>
+        </w:rPr>
+        <w:t>('Int64') </w:t>
+      </w:r>
+      <w:r>
+        <w:rPr>
+          <w:lang w:val="en-PK"/>
+        </w:rPr>
+        <w:t>to convert its datatype.</w:t>
+      </w:r>
+    </w:p>
+    <w:p>
+      <w:pPr>
+        <w:numPr>
+          <w:ilvl w:val="0"/>
+          <w:numId w:val="4"/>
+        </w:numPr>
+        <w:spacing w:line="276" w:lineRule="auto"/>
+        <w:rPr>
+          <w:lang w:val="en-PK"/>
+        </w:rPr>
+      </w:pPr>
+      <w:r>
+        <w:rPr>
+          <w:b/>
+          <w:bCs/>
+          <w:lang w:val="en-PK"/>
+        </w:rPr>
+        <w:lastRenderedPageBreak/>
+        <w:t>Removed duplicate rows from the dataset –</w:t>
+      </w:r>
+      <w:r>
+        <w:rPr>
+          <w:lang w:val="en-PK"/>
+        </w:rPr>
+        <w:t xml:space="preserve"> I </w:t>
+      </w:r>
+      <w:proofErr w:type="gramStart"/>
+      <w:r>
+        <w:rPr>
+          <w:lang w:val="en-PK"/>
+        </w:rPr>
+        <w:t>used </w:t>
+      </w:r>
+      <w:r>
+        <w:rPr>
+          <w:rFonts w:ascii="Consolas" w:hAnsi="Consolas"/>
+          <w:sz w:val="20"/>
+          <w:szCs w:val="20"/>
+          <w:lang w:val="en-PK"/>
+        </w:rPr>
+        <w:t>.</w:t>
+      </w:r>
+      <w:proofErr w:type="spellStart"/>
+      <w:r>
+        <w:rPr>
+          <w:rFonts w:ascii="Consolas" w:hAnsi="Consolas"/>
+          <w:sz w:val="20"/>
+          <w:szCs w:val="20"/>
+          <w:lang w:val="en-PK"/>
+        </w:rPr>
+        <w:t>drop</w:t>
+      </w:r>
+      <w:proofErr w:type="gramEnd"/>
+      <w:r>
+        <w:rPr>
+          <w:rFonts w:ascii="Consolas" w:hAnsi="Consolas"/>
+          <w:sz w:val="20"/>
+          <w:szCs w:val="20"/>
+          <w:lang w:val="en-PK"/>
+        </w:rPr>
+        <w:t>_</w:t>
+      </w:r>
+      <w:proofErr w:type="gramStart"/>
+      <w:r>
+        <w:rPr>
+          <w:rFonts w:ascii="Consolas" w:hAnsi="Consolas"/>
+          <w:sz w:val="20"/>
+          <w:szCs w:val="20"/>
+          <w:lang w:val="en-PK"/>
+        </w:rPr>
+        <w:t>duplicates</w:t>
+      </w:r>
+      <w:proofErr w:type="spellEnd"/>
+      <w:r>
+        <w:rPr>
+          <w:rFonts w:ascii="Consolas" w:hAnsi="Consolas"/>
+          <w:sz w:val="20"/>
+          <w:szCs w:val="20"/>
+          <w:lang w:val="en-PK"/>
+        </w:rPr>
+        <w:t>(</w:t>
+      </w:r>
+      <w:proofErr w:type="gramEnd"/>
+      <w:r>
+        <w:rPr>
+          <w:rFonts w:ascii="Consolas" w:hAnsi="Consolas"/>
+          <w:sz w:val="20"/>
+          <w:szCs w:val="20"/>
+          <w:lang w:val="en-PK"/>
+        </w:rPr>
+        <w:t>)</w:t>
+      </w:r>
+      <w:r>
+        <w:rPr>
+          <w:sz w:val="20"/>
+          <w:szCs w:val="20"/>
+          <w:lang w:val="en-PK"/>
+        </w:rPr>
+        <w:t> </w:t>
+      </w:r>
+      <w:r>
+        <w:rPr>
+          <w:lang w:val="en-PK"/>
+        </w:rPr>
+        <w:t>to remove any fully duplicate rows. It had no effect on our dataset because there were no duplicate rows, so the row count remained the same.</w:t>
+      </w:r>
+    </w:p>
+    <w:p>
+      <w:pPr>
+        <w:numPr>
+          <w:ilvl w:val="0"/>
+          <w:numId w:val="4"/>
+        </w:numPr>
+        <w:spacing w:line="276" w:lineRule="auto"/>
+        <w:rPr>
+          <w:lang w:val="en-PK"/>
+        </w:rPr>
+      </w:pPr>
+      <w:r>
+        <w:rPr>
+          <w:b/>
+          <w:bCs/>
+          <w:lang w:val="en-PK"/>
+        </w:rPr>
+        <w:t>Standardised sponsorship, </w:t>
+      </w:r>
+      <w:proofErr w:type="spellStart"/>
+      <w:r>
+        <w:rPr>
+          <w:b/>
+          <w:bCs/>
+          <w:lang w:val="en-PK"/>
+        </w:rPr>
+        <w:t>verified_account</w:t>
+      </w:r>
+      <w:proofErr w:type="spellEnd"/>
+      <w:r>
+        <w:rPr>
+          <w:b/>
+          <w:bCs/>
+          <w:lang w:val="en-PK"/>
+        </w:rPr>
+        <w:t>, and </w:t>
+      </w:r>
+      <w:proofErr w:type="spellStart"/>
+      <w:r>
+        <w:rPr>
+          <w:b/>
+          <w:bCs/>
+          <w:lang w:val="en-PK"/>
+        </w:rPr>
+        <w:t>recruitment_open</w:t>
+      </w:r>
+      <w:proofErr w:type="spellEnd"/>
+      <w:r>
+        <w:rPr>
+          <w:b/>
+          <w:bCs/>
+          <w:lang w:val="en-PK"/>
+        </w:rPr>
+        <w:t> –</w:t>
+      </w:r>
+      <w:r>
+        <w:rPr>
+          <w:lang w:val="en-PK"/>
+        </w:rPr>
+        <w:t xml:space="preserve"> </w:t>
+      </w:r>
+      <w:proofErr w:type="gramStart"/>
+      <w:r>
+        <w:rPr>
+          <w:lang w:val="en-PK"/>
+        </w:rPr>
+        <w:t>Using .</w:t>
+      </w:r>
+      <w:r>
+        <w:rPr>
+          <w:rFonts w:ascii="Consolas" w:hAnsi="Consolas"/>
+          <w:sz w:val="20"/>
+          <w:szCs w:val="20"/>
+          <w:lang w:val="en-PK"/>
+        </w:rPr>
+        <w:t>map</w:t>
+      </w:r>
+      <w:proofErr w:type="gramEnd"/>
+      <w:r>
+        <w:rPr>
+          <w:rFonts w:ascii="Consolas" w:hAnsi="Consolas"/>
+          <w:sz w:val="20"/>
+          <w:szCs w:val="20"/>
+          <w:lang w:val="en-PK"/>
+        </w:rPr>
+        <w:t>(),</w:t>
+      </w:r>
+      <w:r>
+        <w:rPr>
+          <w:sz w:val="20"/>
+          <w:szCs w:val="20"/>
+          <w:lang w:val="en-PK"/>
+        </w:rPr>
+        <w:t xml:space="preserve"> </w:t>
+      </w:r>
+      <w:r>
+        <w:rPr>
+          <w:lang w:val="en-PK"/>
+        </w:rPr>
+        <w:t>I changed the type of these three columns from object to bool. This standardised them from Yes/No values to True/False.</w:t>
+      </w:r>
+    </w:p>
+    <w:p>
+      <w:pPr>
+        <w:numPr>
+          <w:ilvl w:val="0"/>
+          <w:numId w:val="4"/>
+        </w:numPr>
+        <w:spacing w:line="276" w:lineRule="auto"/>
+        <w:rPr>
+          <w:lang w:val="en-PK"/>
+        </w:rPr>
+      </w:pPr>
+      <w:r>
+        <w:rPr>
+          <w:b/>
+          <w:bCs/>
+          <w:lang w:val="en-PK"/>
+        </w:rPr>
+        <w:t>Dropped rows where both </w:t>
+      </w:r>
+      <w:proofErr w:type="spellStart"/>
+      <w:r>
+        <w:rPr>
+          <w:b/>
+          <w:bCs/>
+          <w:lang w:val="en-PK"/>
+        </w:rPr>
+        <w:t>avg_member_age</w:t>
+      </w:r>
+      <w:proofErr w:type="spellEnd"/>
+      <w:r>
+        <w:rPr>
+          <w:b/>
+          <w:bCs/>
+          <w:lang w:val="en-PK"/>
+        </w:rPr>
+        <w:t> and </w:t>
+      </w:r>
+      <w:proofErr w:type="spellStart"/>
+      <w:r>
+        <w:rPr>
+          <w:b/>
+          <w:bCs/>
+          <w:lang w:val="en-PK"/>
+        </w:rPr>
+        <w:t>active_players</w:t>
+      </w:r>
+      <w:proofErr w:type="spellEnd"/>
+      <w:r>
+        <w:rPr>
+          <w:b/>
+          <w:bCs/>
+          <w:lang w:val="en-PK"/>
+        </w:rPr>
+        <w:t> were null –</w:t>
+      </w:r>
+      <w:r>
+        <w:rPr>
+          <w:lang w:val="en-PK"/>
+        </w:rPr>
+        <w:t xml:space="preserve"> I tried </w:t>
+      </w:r>
+      <w:proofErr w:type="gramStart"/>
+      <w:r>
+        <w:rPr>
+          <w:lang w:val="en-PK"/>
+        </w:rPr>
+        <w:t>using </w:t>
+      </w:r>
+      <w:r>
+        <w:rPr>
+          <w:rFonts w:ascii="Consolas" w:hAnsi="Consolas"/>
+          <w:sz w:val="18"/>
+          <w:szCs w:val="18"/>
+          <w:lang w:val="en-PK"/>
+        </w:rPr>
+        <w:t>.</w:t>
+      </w:r>
+      <w:proofErr w:type="spellStart"/>
+      <w:r>
+        <w:rPr>
+          <w:rFonts w:ascii="Consolas" w:hAnsi="Consolas"/>
+          <w:sz w:val="18"/>
+          <w:szCs w:val="18"/>
+          <w:lang w:val="en-PK"/>
+        </w:rPr>
+        <w:t>dropna</w:t>
+      </w:r>
+      <w:proofErr w:type="spellEnd"/>
+      <w:proofErr w:type="gramEnd"/>
+      <w:r>
+        <w:rPr>
+          <w:rFonts w:ascii="Consolas" w:hAnsi="Consolas"/>
+          <w:sz w:val="18"/>
+          <w:szCs w:val="18"/>
+          <w:lang w:val="en-PK"/>
+        </w:rPr>
+        <w:t>()</w:t>
+      </w:r>
+      <w:r>
+        <w:rPr>
+          <w:sz w:val="18"/>
+          <w:szCs w:val="18"/>
+          <w:lang w:val="en-PK"/>
+        </w:rPr>
+        <w:t> </w:t>
+      </w:r>
+      <w:r>
+        <w:rPr>
+          <w:lang w:val="en-PK"/>
+        </w:rPr>
+        <w:t>to remove rows where both columns were null, but it did not affect the dataset. This was because we had already filled missing values in </w:t>
+      </w:r>
+      <w:proofErr w:type="spellStart"/>
+      <w:r>
+        <w:rPr>
+          <w:lang w:val="en-PK"/>
+        </w:rPr>
+        <w:t>avg_member_age</w:t>
+      </w:r>
+      <w:proofErr w:type="spellEnd"/>
+      <w:r>
+        <w:rPr>
+          <w:lang w:val="en-PK"/>
+        </w:rPr>
+        <w:t> with the median and already dropped rows where </w:t>
+      </w:r>
+      <w:proofErr w:type="spellStart"/>
+      <w:r>
+        <w:rPr>
+          <w:lang w:val="en-PK"/>
+        </w:rPr>
+        <w:t>active_players</w:t>
+      </w:r>
+      <w:proofErr w:type="spellEnd"/>
+      <w:r>
+        <w:rPr>
+          <w:lang w:val="en-PK"/>
+        </w:rPr>
+        <w:t> was null.</w:t>
+      </w:r>
+    </w:p>
+    <w:p>
+      <w:pPr>
+        <w:numPr>
+          <w:ilvl w:val="0"/>
+          <w:numId w:val="4"/>
+        </w:numPr>
+        <w:spacing w:line="276" w:lineRule="auto"/>
+        <w:rPr>
+          <w:lang w:val="en-PK"/>
+        </w:rPr>
+      </w:pPr>
+      <w:r>
+        <w:rPr>
+          <w:b/>
+          <w:bCs/>
+          <w:lang w:val="en-PK"/>
+        </w:rPr>
+        <w:t>Backward filled </w:t>
+      </w:r>
+      <w:proofErr w:type="spellStart"/>
+      <w:r>
+        <w:rPr>
+          <w:b/>
+          <w:bCs/>
+          <w:lang w:val="en-PK"/>
+        </w:rPr>
+        <w:t>top_player_rank</w:t>
+      </w:r>
+      <w:proofErr w:type="spellEnd"/>
+      <w:r>
+        <w:rPr>
+          <w:b/>
+          <w:bCs/>
+          <w:lang w:val="en-PK"/>
+        </w:rPr>
+        <w:t> –</w:t>
+      </w:r>
+      <w:r>
+        <w:rPr>
+          <w:lang w:val="en-PK"/>
+        </w:rPr>
+        <w:t xml:space="preserve"> </w:t>
+      </w:r>
+      <w:proofErr w:type="gramStart"/>
+      <w:r>
+        <w:rPr>
+          <w:lang w:val="en-PK"/>
+        </w:rPr>
+        <w:t>Using </w:t>
+      </w:r>
+      <w:r>
+        <w:rPr>
+          <w:rFonts w:ascii="Consolas" w:hAnsi="Consolas"/>
+          <w:sz w:val="18"/>
+          <w:szCs w:val="18"/>
+          <w:lang w:val="en-PK"/>
+        </w:rPr>
+        <w:t>.</w:t>
+      </w:r>
+      <w:proofErr w:type="spellStart"/>
+      <w:r>
+        <w:rPr>
+          <w:rFonts w:ascii="Consolas" w:hAnsi="Consolas"/>
+          <w:sz w:val="18"/>
+          <w:szCs w:val="18"/>
+          <w:lang w:val="en-PK"/>
+        </w:rPr>
+        <w:t>bfill</w:t>
+      </w:r>
+      <w:proofErr w:type="spellEnd"/>
+      <w:proofErr w:type="gramEnd"/>
+      <w:r>
+        <w:rPr>
+          <w:rFonts w:ascii="Consolas" w:hAnsi="Consolas"/>
+          <w:sz w:val="18"/>
+          <w:szCs w:val="18"/>
+          <w:lang w:val="en-PK"/>
+        </w:rPr>
+        <w:t>()</w:t>
+      </w:r>
+      <w:r>
+        <w:rPr>
+          <w:lang w:val="en-PK"/>
+        </w:rPr>
+        <w:t>, I filled all null values in </w:t>
+      </w:r>
+      <w:proofErr w:type="spellStart"/>
+      <w:r>
+        <w:rPr>
+          <w:lang w:val="en-PK"/>
+        </w:rPr>
+        <w:t>top_player_rank</w:t>
+      </w:r>
+      <w:proofErr w:type="spellEnd"/>
+      <w:r>
+        <w:rPr>
+          <w:lang w:val="en-PK"/>
+        </w:rPr>
+        <w:t>. This assumed that the next community’s rank was a reasonable substitute.</w:t>
+      </w:r>
+    </w:p>
+    <w:p>
+      <w:pPr>
+        <w:numPr>
+          <w:ilvl w:val="0"/>
+          <w:numId w:val="4"/>
+        </w:numPr>
+        <w:spacing w:line="276" w:lineRule="auto"/>
+        <w:rPr>
+          <w:lang w:val="en-PK"/>
+        </w:rPr>
+      </w:pPr>
+      <w:r>
+        <w:rPr>
+          <w:b/>
+          <w:bCs/>
+          <w:lang w:val="en-PK"/>
+        </w:rPr>
+        <w:t>Converted </w:t>
+      </w:r>
+      <w:proofErr w:type="spellStart"/>
+      <w:r>
+        <w:rPr>
+          <w:b/>
+          <w:bCs/>
+          <w:lang w:val="en-PK"/>
+        </w:rPr>
+        <w:t>coaching_staff</w:t>
+      </w:r>
+      <w:proofErr w:type="spellEnd"/>
+      <w:r>
+        <w:rPr>
+          <w:b/>
+          <w:bCs/>
+          <w:lang w:val="en-PK"/>
+        </w:rPr>
+        <w:t> from int64 to float32 to check memory impact –</w:t>
+      </w:r>
+      <w:r>
+        <w:rPr>
+          <w:lang w:val="en-PK"/>
+        </w:rPr>
+        <w:t xml:space="preserve"> First, I recorded the memory usage of </w:t>
+      </w:r>
+      <w:proofErr w:type="spellStart"/>
+      <w:r>
+        <w:rPr>
+          <w:lang w:val="en-PK"/>
+        </w:rPr>
+        <w:t>coaching_staff</w:t>
+      </w:r>
+      <w:proofErr w:type="spellEnd"/>
+      <w:r>
+        <w:rPr>
+          <w:lang w:val="en-PK"/>
+        </w:rPr>
+        <w:t xml:space="preserve"> with its original </w:t>
+      </w:r>
+      <w:proofErr w:type="spellStart"/>
+      <w:r>
+        <w:rPr>
+          <w:lang w:val="en-PK"/>
+        </w:rPr>
+        <w:t>dtype</w:t>
+      </w:r>
+      <w:proofErr w:type="spellEnd"/>
+      <w:r>
+        <w:rPr>
+          <w:lang w:val="en-PK"/>
+        </w:rPr>
+        <w:t>. After converting to float32, I compared the memory usage. The result was a 50% memory reduction (2x smaller).</w:t>
+      </w:r>
+    </w:p>
+    <w:p>
+      <w:pPr>
+        <w:numPr>
+          <w:ilvl w:val="0"/>
+          <w:numId w:val="4"/>
+        </w:numPr>
+        <w:spacing w:line="276" w:lineRule="auto"/>
+        <w:rPr>
+          <w:lang w:val="en-PK"/>
+        </w:rPr>
+      </w:pPr>
+      <w:r>
+        <w:rPr>
+          <w:b/>
+          <w:bCs/>
+          <w:lang w:val="en-PK"/>
+        </w:rPr>
+        <w:t>Dropped zero</w:t>
+      </w:r>
+      <w:r>
+        <w:rPr>
+          <w:b/>
+          <w:bCs/>
+          <w:lang w:val="en-PK"/>
+        </w:rPr>
+        <w:noBreakHyphen/>
+        <w:t>variance columns –</w:t>
+      </w:r>
+      <w:r>
+        <w:rPr>
+          <w:lang w:val="en-PK"/>
+        </w:rPr>
+        <w:t xml:space="preserve"> Some columns had no unique values, which could cause problems during analysis. I created a </w:t>
+      </w:r>
+      <w:proofErr w:type="spellStart"/>
+      <w:r>
+        <w:rPr>
+          <w:lang w:val="en-PK"/>
+        </w:rPr>
+        <w:t>zero_variance_mask</w:t>
+      </w:r>
+      <w:proofErr w:type="spellEnd"/>
+      <w:r>
+        <w:rPr>
+          <w:lang w:val="en-PK"/>
+        </w:rPr>
+        <w:t> and used it to identify those columns. I then dropped them. The three columns dropped were sponsorship, </w:t>
+      </w:r>
+      <w:proofErr w:type="spellStart"/>
+      <w:r>
+        <w:rPr>
+          <w:lang w:val="en-PK"/>
+        </w:rPr>
+        <w:t>verified_account</w:t>
+      </w:r>
+      <w:proofErr w:type="spellEnd"/>
+      <w:r>
+        <w:rPr>
+          <w:lang w:val="en-PK"/>
+        </w:rPr>
+        <w:t>, and </w:t>
+      </w:r>
+      <w:proofErr w:type="spellStart"/>
+      <w:r>
+        <w:rPr>
+          <w:lang w:val="en-PK"/>
+        </w:rPr>
+        <w:t>recruitment_open</w:t>
+      </w:r>
+      <w:proofErr w:type="spellEnd"/>
+      <w:r>
+        <w:rPr>
+          <w:lang w:val="en-PK"/>
+        </w:rPr>
+        <w:t>.</w:t>
+      </w:r>
+    </w:p>
+    <w:p>
+      <w:pPr>
+        <w:numPr>
+          <w:ilvl w:val="0"/>
+          <w:numId w:val="4"/>
+        </w:numPr>
+        <w:spacing w:line="276" w:lineRule="auto"/>
+        <w:rPr>
+          <w:lang w:val="en-PK"/>
+        </w:rPr>
+      </w:pPr>
+      <w:r>
+        <w:rPr>
+          <w:b/>
+          <w:bCs/>
+          <w:lang w:val="en-PK"/>
+        </w:rPr>
+        <w:t>Replaced zeros in </w:t>
+      </w:r>
+      <w:proofErr w:type="spellStart"/>
+      <w:r>
+        <w:rPr>
+          <w:b/>
+          <w:bCs/>
+          <w:lang w:val="en-PK"/>
+        </w:rPr>
+        <w:t>tournaments_hosted</w:t>
+      </w:r>
+      <w:proofErr w:type="spellEnd"/>
+      <w:r>
+        <w:rPr>
+          <w:b/>
+          <w:bCs/>
+          <w:lang w:val="en-PK"/>
+        </w:rPr>
+        <w:t xml:space="preserve"> with </w:t>
+      </w:r>
+      <w:proofErr w:type="spellStart"/>
+      <w:r>
+        <w:rPr>
+          <w:b/>
+          <w:bCs/>
+          <w:lang w:val="en-PK"/>
+        </w:rPr>
+        <w:t>NaN</w:t>
+      </w:r>
+      <w:proofErr w:type="spellEnd"/>
+      <w:r>
+        <w:rPr>
+          <w:b/>
+          <w:bCs/>
+          <w:lang w:val="en-PK"/>
+        </w:rPr>
+        <w:t> –</w:t>
+      </w:r>
+      <w:r>
+        <w:rPr>
+          <w:lang w:val="en-PK"/>
+        </w:rPr>
+        <w:t xml:space="preserve"> </w:t>
+      </w:r>
+      <w:proofErr w:type="gramStart"/>
+      <w:r>
+        <w:rPr>
+          <w:lang w:val="en-PK"/>
+        </w:rPr>
+        <w:t>Using </w:t>
+      </w:r>
+      <w:r>
+        <w:rPr>
+          <w:rFonts w:ascii="Consolas" w:hAnsi="Consolas"/>
+          <w:sz w:val="18"/>
+          <w:szCs w:val="18"/>
+          <w:lang w:val="en-PK"/>
+        </w:rPr>
+        <w:t>.replace</w:t>
+      </w:r>
+      <w:proofErr w:type="gramEnd"/>
+      <w:r>
+        <w:rPr>
+          <w:rFonts w:ascii="Consolas" w:hAnsi="Consolas"/>
+          <w:sz w:val="18"/>
+          <w:szCs w:val="18"/>
+          <w:lang w:val="en-PK"/>
+        </w:rPr>
+        <w:t>()</w:t>
+      </w:r>
+      <w:r>
+        <w:rPr>
+          <w:lang w:val="en-PK"/>
+        </w:rPr>
+        <w:t>, I replaced every 0 in </w:t>
+      </w:r>
+      <w:proofErr w:type="spellStart"/>
+      <w:r>
+        <w:rPr>
+          <w:lang w:val="en-PK"/>
+        </w:rPr>
+        <w:t>tournaments_hosted</w:t>
+      </w:r>
+      <w:proofErr w:type="spellEnd"/>
+      <w:r>
+        <w:rPr>
+          <w:lang w:val="en-PK"/>
+        </w:rPr>
+        <w:t> with </w:t>
+      </w:r>
+      <w:proofErr w:type="spellStart"/>
+      <w:r>
+        <w:rPr>
+          <w:lang w:val="en-PK"/>
+        </w:rPr>
+        <w:t>np.nan</w:t>
+      </w:r>
+      <w:proofErr w:type="spellEnd"/>
+      <w:r>
+        <w:rPr>
+          <w:lang w:val="en-PK"/>
+        </w:rPr>
+        <w:t>.</w:t>
+      </w:r>
+    </w:p>
+    <w:p>
+      <w:pPr>
+        <w:numPr>
+          <w:ilvl w:val="0"/>
+          <w:numId w:val="4"/>
+        </w:numPr>
+        <w:spacing w:line="276" w:lineRule="auto"/>
+        <w:rPr>
+          <w:lang w:val="en-PK"/>
+        </w:rPr>
+      </w:pPr>
+      <w:r>
+        <w:rPr>
+          <w:b/>
+          <w:bCs/>
+          <w:lang w:val="en-PK"/>
+        </w:rPr>
+        <w:t>Capped extreme values in </w:t>
+      </w:r>
+      <w:proofErr w:type="spellStart"/>
+      <w:r>
+        <w:rPr>
+          <w:b/>
+          <w:bCs/>
+          <w:lang w:val="en-PK"/>
+        </w:rPr>
+        <w:t>member_count</w:t>
+      </w:r>
+      <w:proofErr w:type="spellEnd"/>
+      <w:r>
+        <w:rPr>
+          <w:b/>
+          <w:bCs/>
+          <w:lang w:val="en-PK"/>
+        </w:rPr>
+        <w:t> by clipping at the 99th percentile –</w:t>
+      </w:r>
+      <w:r>
+        <w:rPr>
+          <w:lang w:val="en-PK"/>
+        </w:rPr>
+        <w:t xml:space="preserve"> </w:t>
+      </w:r>
+      <w:proofErr w:type="gramStart"/>
+      <w:r>
+        <w:rPr>
+          <w:lang w:val="en-PK"/>
+        </w:rPr>
+        <w:t>Using </w:t>
+      </w:r>
+      <w:r>
+        <w:rPr>
+          <w:rFonts w:ascii="Consolas" w:hAnsi="Consolas"/>
+          <w:sz w:val="18"/>
+          <w:szCs w:val="18"/>
+          <w:lang w:val="en-PK"/>
+        </w:rPr>
+        <w:t>.clip</w:t>
+      </w:r>
+      <w:proofErr w:type="gramEnd"/>
+      <w:r>
+        <w:rPr>
+          <w:rFonts w:ascii="Consolas" w:hAnsi="Consolas"/>
+          <w:sz w:val="18"/>
+          <w:szCs w:val="18"/>
+          <w:lang w:val="en-PK"/>
+        </w:rPr>
+        <w:t>()</w:t>
+      </w:r>
+      <w:r>
+        <w:rPr>
+          <w:lang w:val="en-PK"/>
+        </w:rPr>
+        <w:t>, I capped extreme values of </w:t>
+      </w:r>
+      <w:proofErr w:type="spellStart"/>
+      <w:r>
+        <w:rPr>
+          <w:lang w:val="en-PK"/>
+        </w:rPr>
+        <w:t>member_count</w:t>
+      </w:r>
+      <w:proofErr w:type="spellEnd"/>
+      <w:r>
+        <w:rPr>
+          <w:lang w:val="en-PK"/>
+        </w:rPr>
+        <w:t> at the 99th percentile.</w:t>
+      </w:r>
+    </w:p>
+    <w:p>
+      <w:pPr>
+        <w:numPr>
+          <w:ilvl w:val="0"/>
+          <w:numId w:val="4"/>
+        </w:numPr>
+        <w:spacing w:line="276" w:lineRule="auto"/>
+        <w:rPr>
+          <w:lang w:val="en-PK"/>
+        </w:rPr>
+      </w:pPr>
+      <w:r>
+        <w:rPr>
+          <w:b/>
+          <w:bCs/>
+          <w:lang w:val="en-PK"/>
+        </w:rPr>
+        <w:t>Fixed impossible future years –</w:t>
+      </w:r>
+      <w:r>
+        <w:rPr>
+          <w:lang w:val="en-PK"/>
+        </w:rPr>
+        <w:t xml:space="preserve"> In Session 1, I noticed anomalies in </w:t>
+      </w:r>
+      <w:proofErr w:type="spellStart"/>
+      <w:r>
+        <w:rPr>
+          <w:lang w:val="en-PK"/>
+        </w:rPr>
+        <w:t>year_founded</w:t>
+      </w:r>
+      <w:proofErr w:type="spellEnd"/>
+      <w:r>
+        <w:rPr>
+          <w:lang w:val="en-PK"/>
+        </w:rPr>
+        <w:t xml:space="preserve">, such as 3005 and 2087. To fix this, I </w:t>
+      </w:r>
+      <w:proofErr w:type="gramStart"/>
+      <w:r>
+        <w:rPr>
+          <w:lang w:val="en-PK"/>
+        </w:rPr>
+        <w:t>used </w:t>
+      </w:r>
+      <w:r>
+        <w:rPr>
+          <w:rFonts w:ascii="Consolas" w:hAnsi="Consolas"/>
+          <w:sz w:val="18"/>
+          <w:szCs w:val="18"/>
+          <w:lang w:val="en-PK"/>
+        </w:rPr>
+        <w:t>.loc</w:t>
+      </w:r>
+      <w:proofErr w:type="gramEnd"/>
+      <w:r>
+        <w:rPr>
+          <w:sz w:val="18"/>
+          <w:szCs w:val="18"/>
+          <w:lang w:val="en-PK"/>
+        </w:rPr>
+        <w:t> </w:t>
+      </w:r>
+      <w:r>
+        <w:rPr>
+          <w:lang w:val="en-PK"/>
+        </w:rPr>
+        <w:t>with a condition to replace all years greater than 2026 with </w:t>
+      </w:r>
+      <w:proofErr w:type="spellStart"/>
+      <w:r>
+        <w:rPr>
+          <w:lang w:val="en-PK"/>
+        </w:rPr>
+        <w:t>np.nan</w:t>
+      </w:r>
+      <w:proofErr w:type="spellEnd"/>
+      <w:r>
+        <w:rPr>
+          <w:lang w:val="en-PK"/>
+        </w:rPr>
+        <w:t>.</w:t>
+      </w:r>
+    </w:p>
+    <w:p>
+      <w:pPr>
+        <w:numPr>
+          <w:ilvl w:val="0"/>
+          <w:numId w:val="4"/>
+        </w:numPr>
+        <w:spacing w:line="276" w:lineRule="auto"/>
+        <w:rPr>
+          <w:lang w:val="en-PK"/>
+        </w:rPr>
+      </w:pPr>
+      <w:r>
+        <w:rPr>
+          <w:b/>
+          <w:bCs/>
+          <w:lang w:val="en-PK"/>
+        </w:rPr>
+        <w:t>Removed special characters, symbols, and punctuation from </w:t>
+      </w:r>
+      <w:proofErr w:type="spellStart"/>
+      <w:r>
+        <w:rPr>
+          <w:b/>
+          <w:bCs/>
+          <w:lang w:val="en-PK"/>
+        </w:rPr>
+        <w:t>community_name</w:t>
+      </w:r>
+      <w:proofErr w:type="spellEnd"/>
+      <w:r>
+        <w:rPr>
+          <w:b/>
+          <w:bCs/>
+          <w:lang w:val="en-PK"/>
+        </w:rPr>
+        <w:t> –</w:t>
+      </w:r>
+      <w:r>
+        <w:rPr>
+          <w:lang w:val="en-PK"/>
+        </w:rPr>
+        <w:t xml:space="preserve"> I noticed special characters and punctuation in the </w:t>
+      </w:r>
+      <w:proofErr w:type="spellStart"/>
+      <w:r>
+        <w:rPr>
+          <w:lang w:val="en-PK"/>
+        </w:rPr>
+        <w:t>community_name</w:t>
+      </w:r>
+      <w:proofErr w:type="spellEnd"/>
+      <w:r>
+        <w:rPr>
+          <w:lang w:val="en-PK"/>
+        </w:rPr>
+        <w:t> column, so I used </w:t>
+      </w:r>
+      <w:r>
+        <w:rPr>
+          <w:rFonts w:ascii="Consolas" w:hAnsi="Consolas"/>
+          <w:sz w:val="18"/>
+          <w:szCs w:val="18"/>
+          <w:lang w:val="en-PK"/>
+        </w:rPr>
+        <w:t>.</w:t>
+      </w:r>
+      <w:proofErr w:type="spellStart"/>
+      <w:proofErr w:type="gramStart"/>
+      <w:r>
+        <w:rPr>
+          <w:rFonts w:ascii="Consolas" w:hAnsi="Consolas"/>
+          <w:sz w:val="18"/>
+          <w:szCs w:val="18"/>
+          <w:lang w:val="en-PK"/>
+        </w:rPr>
+        <w:t>str.replace</w:t>
+      </w:r>
+      <w:proofErr w:type="spellEnd"/>
+      <w:proofErr w:type="gramEnd"/>
+      <w:r>
+        <w:rPr>
+          <w:rFonts w:ascii="Consolas" w:hAnsi="Consolas"/>
+          <w:sz w:val="18"/>
+          <w:szCs w:val="18"/>
+          <w:lang w:val="en-PK"/>
+        </w:rPr>
+        <w:t>() </w:t>
+      </w:r>
+      <w:r>
+        <w:rPr>
+          <w:lang w:val="en-PK"/>
+        </w:rPr>
+        <w:t>with a regex to remove them.</w:t>
+      </w:r>
+    </w:p>
+    <w:p>
+      <w:pPr>
+        <w:numPr>
+          <w:ilvl w:val="0"/>
+          <w:numId w:val="4"/>
+        </w:numPr>
+        <w:spacing w:line="276" w:lineRule="auto"/>
+        <w:rPr>
+          <w:lang w:val="en-PK"/>
+        </w:rPr>
+      </w:pPr>
+      <w:r>
+        <w:rPr>
+          <w:b/>
+          <w:bCs/>
+          <w:lang w:val="en-PK"/>
+        </w:rPr>
+        <w:t>Checked for rows where </w:t>
+      </w:r>
+      <w:proofErr w:type="spellStart"/>
+      <w:r>
+        <w:rPr>
+          <w:b/>
+          <w:bCs/>
+          <w:lang w:val="en-PK"/>
+        </w:rPr>
+        <w:t>active_players</w:t>
+      </w:r>
+      <w:proofErr w:type="spellEnd"/>
+      <w:r>
+        <w:rPr>
+          <w:b/>
+          <w:bCs/>
+          <w:lang w:val="en-PK"/>
+        </w:rPr>
+        <w:t> exceed </w:t>
+      </w:r>
+      <w:proofErr w:type="spellStart"/>
+      <w:r>
+        <w:rPr>
+          <w:b/>
+          <w:bCs/>
+          <w:lang w:val="en-PK"/>
+        </w:rPr>
+        <w:t>member_count</w:t>
+      </w:r>
+      <w:proofErr w:type="spellEnd"/>
+      <w:r>
+        <w:rPr>
+          <w:b/>
+          <w:bCs/>
+          <w:lang w:val="en-PK"/>
+        </w:rPr>
+        <w:t> –</w:t>
+      </w:r>
+      <w:r>
+        <w:rPr>
+          <w:lang w:val="en-PK"/>
+        </w:rPr>
+        <w:t xml:space="preserve"> I created a mask to find rows where </w:t>
+      </w:r>
+      <w:proofErr w:type="spellStart"/>
+      <w:r>
+        <w:rPr>
+          <w:lang w:val="en-PK"/>
+        </w:rPr>
+        <w:t>active_players</w:t>
+      </w:r>
+      <w:proofErr w:type="spellEnd"/>
+      <w:r>
+        <w:rPr>
+          <w:lang w:val="en-PK"/>
+        </w:rPr>
+        <w:t> was greater than </w:t>
+      </w:r>
+      <w:proofErr w:type="spellStart"/>
+      <w:r>
+        <w:rPr>
+          <w:lang w:val="en-PK"/>
+        </w:rPr>
+        <w:t>member_count</w:t>
+      </w:r>
+      <w:proofErr w:type="spellEnd"/>
+      <w:r>
+        <w:rPr>
+          <w:lang w:val="en-PK"/>
+        </w:rPr>
+        <w:t>. No such rows existed, so the sum remained zero.</w:t>
+      </w:r>
+    </w:p>
+    <w:p>
+      <w:pPr>
+        <w:numPr>
+          <w:ilvl w:val="0"/>
+          <w:numId w:val="4"/>
+        </w:numPr>
+        <w:spacing w:line="276" w:lineRule="auto"/>
+        <w:rPr>
+          <w:lang w:val="en-PK"/>
+        </w:rPr>
+      </w:pPr>
+      <w:r>
+        <w:rPr>
+          <w:b/>
+          <w:bCs/>
+          <w:lang w:val="en-PK"/>
+        </w:rPr>
+        <w:t>Found duplicate community names –</w:t>
+      </w:r>
+      <w:r>
+        <w:rPr>
+          <w:lang w:val="en-PK"/>
+        </w:rPr>
+        <w:t xml:space="preserve"> </w:t>
+      </w:r>
+      <w:proofErr w:type="gramStart"/>
+      <w:r>
+        <w:rPr>
+          <w:lang w:val="en-PK"/>
+        </w:rPr>
+        <w:t>Using </w:t>
+      </w:r>
+      <w:r>
+        <w:rPr>
+          <w:rFonts w:ascii="Consolas" w:hAnsi="Consolas"/>
+          <w:sz w:val="18"/>
+          <w:szCs w:val="18"/>
+          <w:lang w:val="en-PK"/>
+        </w:rPr>
+        <w:t>.duplicated</w:t>
+      </w:r>
+      <w:proofErr w:type="gramEnd"/>
+      <w:r>
+        <w:rPr>
+          <w:rFonts w:ascii="Consolas" w:hAnsi="Consolas"/>
+          <w:sz w:val="18"/>
+          <w:szCs w:val="18"/>
+          <w:lang w:val="en-PK"/>
+        </w:rPr>
+        <w:t>()</w:t>
+      </w:r>
+      <w:r>
+        <w:rPr>
+          <w:lang w:val="en-PK"/>
+        </w:rPr>
+        <w:t>, I counted how many community names were identical. There were 229 rows with duplicate names.</w:t>
+      </w:r>
+    </w:p>
+    <w:p>
+      <w:pPr>
+        <w:numPr>
+          <w:ilvl w:val="0"/>
+          <w:numId w:val="4"/>
+        </w:numPr>
+        <w:spacing w:line="276" w:lineRule="auto"/>
+        <w:rPr>
+          <w:lang w:val="en-PK"/>
+        </w:rPr>
+      </w:pPr>
+      <w:r>
+        <w:rPr>
+          <w:b/>
+          <w:bCs/>
+          <w:lang w:val="en-PK"/>
+        </w:rPr>
+        <w:lastRenderedPageBreak/>
+        <w:t>Stripped leading and trailing whitespace from string columns –</w:t>
+      </w:r>
+      <w:r>
+        <w:rPr>
+          <w:lang w:val="en-PK"/>
+        </w:rPr>
+        <w:t xml:space="preserve"> </w:t>
+      </w:r>
+      <w:proofErr w:type="gramStart"/>
+      <w:r>
+        <w:rPr>
+          <w:lang w:val="en-PK"/>
+        </w:rPr>
+        <w:t>Using </w:t>
+      </w:r>
+      <w:r>
+        <w:rPr>
+          <w:rFonts w:ascii="Consolas" w:hAnsi="Consolas"/>
+          <w:sz w:val="18"/>
+          <w:szCs w:val="18"/>
+          <w:lang w:val="en-PK"/>
+        </w:rPr>
+        <w:t>.</w:t>
+      </w:r>
+      <w:proofErr w:type="spellStart"/>
+      <w:r>
+        <w:rPr>
+          <w:rFonts w:ascii="Consolas" w:hAnsi="Consolas"/>
+          <w:sz w:val="18"/>
+          <w:szCs w:val="18"/>
+          <w:lang w:val="en-PK"/>
+        </w:rPr>
+        <w:t>select</w:t>
+      </w:r>
+      <w:proofErr w:type="gramEnd"/>
+      <w:r>
+        <w:rPr>
+          <w:rFonts w:ascii="Consolas" w:hAnsi="Consolas"/>
+          <w:sz w:val="18"/>
+          <w:szCs w:val="18"/>
+          <w:lang w:val="en-PK"/>
+        </w:rPr>
+        <w:t>_</w:t>
+      </w:r>
+      <w:proofErr w:type="gramStart"/>
+      <w:r>
+        <w:rPr>
+          <w:rFonts w:ascii="Consolas" w:hAnsi="Consolas"/>
+          <w:sz w:val="18"/>
+          <w:szCs w:val="18"/>
+          <w:lang w:val="en-PK"/>
+        </w:rPr>
+        <w:t>dtypes</w:t>
+      </w:r>
+      <w:proofErr w:type="spellEnd"/>
+      <w:r>
+        <w:rPr>
+          <w:rFonts w:ascii="Consolas" w:hAnsi="Consolas"/>
+          <w:sz w:val="18"/>
+          <w:szCs w:val="18"/>
+          <w:lang w:val="en-PK"/>
+        </w:rPr>
+        <w:t>(</w:t>
+      </w:r>
+      <w:proofErr w:type="gramEnd"/>
+      <w:r>
+        <w:rPr>
+          <w:rFonts w:ascii="Consolas" w:hAnsi="Consolas"/>
+          <w:sz w:val="18"/>
+          <w:szCs w:val="18"/>
+          <w:lang w:val="en-PK"/>
+        </w:rPr>
+        <w:t>)</w:t>
+      </w:r>
+      <w:r>
+        <w:rPr>
+          <w:lang w:val="en-PK"/>
+        </w:rPr>
+        <w:t>, I identified all columns with string datatype. Then I applied </w:t>
+      </w:r>
+      <w:r>
+        <w:rPr>
+          <w:rFonts w:ascii="Consolas" w:hAnsi="Consolas"/>
+          <w:sz w:val="18"/>
+          <w:szCs w:val="18"/>
+          <w:lang w:val="en-PK"/>
+        </w:rPr>
+        <w:t>.</w:t>
+      </w:r>
+      <w:proofErr w:type="spellStart"/>
+      <w:proofErr w:type="gramStart"/>
+      <w:r>
+        <w:rPr>
+          <w:rFonts w:ascii="Consolas" w:hAnsi="Consolas"/>
+          <w:sz w:val="18"/>
+          <w:szCs w:val="18"/>
+          <w:lang w:val="en-PK"/>
+        </w:rPr>
+        <w:t>str.strip</w:t>
+      </w:r>
+      <w:proofErr w:type="spellEnd"/>
+      <w:proofErr w:type="gramEnd"/>
+      <w:r>
+        <w:rPr>
+          <w:rFonts w:ascii="Consolas" w:hAnsi="Consolas"/>
+          <w:sz w:val="18"/>
+          <w:szCs w:val="18"/>
+          <w:lang w:val="en-PK"/>
+        </w:rPr>
+        <w:t>()</w:t>
+      </w:r>
+      <w:r>
+        <w:rPr>
+          <w:sz w:val="18"/>
+          <w:szCs w:val="18"/>
+          <w:lang w:val="en-PK"/>
+        </w:rPr>
+        <w:t> </w:t>
+      </w:r>
+      <w:r>
+        <w:rPr>
+          <w:lang w:val="en-PK"/>
+        </w:rPr>
+        <w:t>to remove leading and trailing whitespace from those columns.</w:t>
+      </w:r>
+    </w:p>
+    <w:p>
+      <w:pPr>
+        <w:numPr>
+          <w:ilvl w:val="0"/>
+          <w:numId w:val="4"/>
+        </w:numPr>
+        <w:spacing w:line="276" w:lineRule="auto"/>
+        <w:rPr>
+          <w:lang w:val="en-PK"/>
+        </w:rPr>
+      </w:pPr>
+      <w:r>
+        <w:rPr>
+          <w:b/>
+          <w:bCs/>
+          <w:lang w:val="en-PK"/>
+        </w:rPr>
+        <w:t>Filled all remaining missing values –</w:t>
+      </w:r>
+      <w:r>
+        <w:rPr>
+          <w:lang w:val="en-PK"/>
+        </w:rPr>
+        <w:t xml:space="preserve"> I started with the region column, filling its null values with the string 'Unknown'. Then I filled missing values in </w:t>
+      </w:r>
+      <w:proofErr w:type="spellStart"/>
+      <w:r>
+        <w:rPr>
+          <w:lang w:val="en-PK"/>
+        </w:rPr>
+        <w:t>country_of_origin</w:t>
+      </w:r>
+      <w:proofErr w:type="spellEnd"/>
+      <w:r>
+        <w:rPr>
+          <w:lang w:val="en-PK"/>
+        </w:rPr>
+        <w:t> with 'Unknown'. Next, I filled the last missing value in </w:t>
+      </w:r>
+      <w:proofErr w:type="spellStart"/>
+      <w:r>
+        <w:rPr>
+          <w:lang w:val="en-PK"/>
+        </w:rPr>
+        <w:t>top_player_rank</w:t>
+      </w:r>
+      <w:proofErr w:type="spellEnd"/>
+      <w:r>
+        <w:rPr>
+          <w:lang w:val="en-PK"/>
+        </w:rPr>
+        <w:t xml:space="preserve"> (already partially filled </w:t>
+      </w:r>
+      <w:proofErr w:type="gramStart"/>
+      <w:r>
+        <w:rPr>
+          <w:lang w:val="en-PK"/>
+        </w:rPr>
+        <w:t>with </w:t>
+      </w:r>
+      <w:r>
+        <w:rPr>
+          <w:rFonts w:ascii="Consolas" w:hAnsi="Consolas"/>
+          <w:sz w:val="18"/>
+          <w:szCs w:val="18"/>
+          <w:lang w:val="en-PK"/>
+        </w:rPr>
+        <w:t>.</w:t>
+      </w:r>
+      <w:proofErr w:type="spellStart"/>
+      <w:r>
+        <w:rPr>
+          <w:rFonts w:ascii="Consolas" w:hAnsi="Consolas"/>
+          <w:sz w:val="18"/>
+          <w:szCs w:val="18"/>
+          <w:lang w:val="en-PK"/>
+        </w:rPr>
+        <w:t>bfill</w:t>
+      </w:r>
+      <w:proofErr w:type="spellEnd"/>
+      <w:proofErr w:type="gramEnd"/>
+      <w:r>
+        <w:rPr>
+          <w:rFonts w:ascii="Consolas" w:hAnsi="Consolas"/>
+          <w:sz w:val="18"/>
+          <w:szCs w:val="18"/>
+          <w:lang w:val="en-PK"/>
+        </w:rPr>
+        <w:t>()</w:t>
+      </w:r>
+      <w:r>
+        <w:rPr>
+          <w:lang w:val="en-PK"/>
+        </w:rPr>
+        <w:t>) using the median. I also filled platform</w:t>
+      </w:r>
+      <w:r>
+        <w:rPr>
+          <w:lang w:val="en-PK"/>
+        </w:rPr>
+        <w:noBreakHyphen/>
+        <w:t>related columns and </w:t>
+      </w:r>
+      <w:proofErr w:type="spellStart"/>
+      <w:r>
+        <w:rPr>
+          <w:lang w:val="en-PK"/>
+        </w:rPr>
+        <w:t>tournaments_hosted</w:t>
+      </w:r>
+      <w:proofErr w:type="spellEnd"/>
+      <w:r>
+        <w:rPr>
+          <w:lang w:val="en-PK"/>
+        </w:rPr>
+        <w:t xml:space="preserve"> with 0. Finally, I verified </w:t>
+      </w:r>
+      <w:proofErr w:type="gramStart"/>
+      <w:r>
+        <w:rPr>
+          <w:lang w:val="en-PK"/>
+        </w:rPr>
+        <w:t>with </w:t>
+      </w:r>
+      <w:r>
+        <w:rPr>
+          <w:rFonts w:ascii="Consolas" w:hAnsi="Consolas"/>
+          <w:sz w:val="18"/>
+          <w:szCs w:val="18"/>
+          <w:lang w:val="en-PK"/>
+        </w:rPr>
+        <w:t>.</w:t>
+      </w:r>
+      <w:proofErr w:type="spellStart"/>
+      <w:r>
+        <w:rPr>
+          <w:rFonts w:ascii="Consolas" w:hAnsi="Consolas"/>
+          <w:sz w:val="18"/>
+          <w:szCs w:val="18"/>
+          <w:lang w:val="en-PK"/>
+        </w:rPr>
+        <w:t>isnull</w:t>
+      </w:r>
+      <w:proofErr w:type="spellEnd"/>
+      <w:proofErr w:type="gramEnd"/>
+      <w:r>
+        <w:rPr>
+          <w:rFonts w:ascii="Consolas" w:hAnsi="Consolas"/>
+          <w:sz w:val="18"/>
+          <w:szCs w:val="18"/>
+          <w:lang w:val="en-PK"/>
+        </w:rPr>
+        <w:t>(</w:t>
+      </w:r>
+      <w:proofErr w:type="gramStart"/>
+      <w:r>
+        <w:rPr>
+          <w:rFonts w:ascii="Consolas" w:hAnsi="Consolas"/>
+          <w:sz w:val="18"/>
+          <w:szCs w:val="18"/>
+          <w:lang w:val="en-PK"/>
+        </w:rPr>
+        <w:t>).sum</w:t>
+      </w:r>
+      <w:proofErr w:type="gramEnd"/>
+      <w:r>
+        <w:rPr>
+          <w:rFonts w:ascii="Consolas" w:hAnsi="Consolas"/>
+          <w:sz w:val="18"/>
+          <w:szCs w:val="18"/>
+          <w:lang w:val="en-PK"/>
+        </w:rPr>
+        <w:t>(</w:t>
+      </w:r>
+      <w:proofErr w:type="gramStart"/>
+      <w:r>
+        <w:rPr>
+          <w:rFonts w:ascii="Consolas" w:hAnsi="Consolas"/>
+          <w:sz w:val="18"/>
+          <w:szCs w:val="18"/>
+          <w:lang w:val="en-PK"/>
+        </w:rPr>
+        <w:t>).sum</w:t>
+      </w:r>
+      <w:proofErr w:type="gramEnd"/>
+      <w:r>
+        <w:rPr>
+          <w:rFonts w:ascii="Consolas" w:hAnsi="Consolas"/>
+          <w:sz w:val="18"/>
+          <w:szCs w:val="18"/>
+          <w:lang w:val="en-PK"/>
+        </w:rPr>
+        <w:t>()</w:t>
+      </w:r>
+      <w:r>
+        <w:rPr>
+          <w:lang w:val="en-PK"/>
+        </w:rPr>
+        <w:t>, which returned 0, meaning there were no more null values.</w:t>
+      </w:r>
+    </w:p>
+    <w:p>
+      <w:pPr>
+        <w:numPr>
+          <w:ilvl w:val="0"/>
+          <w:numId w:val="4"/>
+        </w:numPr>
+        <w:spacing w:line="276" w:lineRule="auto"/>
+        <w:rPr>
+          <w:b/>
+          <w:bCs/>
+          <w:sz w:val="28"/>
+          <w:szCs w:val="28"/>
+          <w:lang w:val="en-PK"/>
+        </w:rPr>
+      </w:pPr>
+      <w:r>
+        <w:rPr>
+          <w:b/>
+          <w:bCs/>
+          <w:lang w:val="en-PK"/>
+        </w:rPr>
+        <w:t>Reset the order of </w:t>
+      </w:r>
+      <w:proofErr w:type="spellStart"/>
+      <w:r>
+        <w:rPr>
+          <w:b/>
+          <w:bCs/>
+          <w:lang w:val="en-PK"/>
+        </w:rPr>
+        <w:t>community_id</w:t>
+      </w:r>
+      <w:proofErr w:type="spellEnd"/>
+      <w:r>
+        <w:rPr>
+          <w:b/>
+          <w:bCs/>
+          <w:lang w:val="en-PK"/>
+        </w:rPr>
+        <w:t xml:space="preserve"> – </w:t>
+      </w:r>
+      <w:r>
+        <w:rPr>
+          <w:lang w:val="en-PK"/>
+        </w:rPr>
+        <w:t>Cleaning had disrupted the order of </w:t>
+      </w:r>
+      <w:proofErr w:type="spellStart"/>
+      <w:r>
+        <w:rPr>
+          <w:lang w:val="en-PK"/>
+        </w:rPr>
+        <w:t>community_id</w:t>
+      </w:r>
+      <w:proofErr w:type="spellEnd"/>
+      <w:r>
+        <w:rPr>
+          <w:lang w:val="en-PK"/>
+        </w:rPr>
+        <w:t>. To give it a proper numerical representation, I used the </w:t>
+      </w:r>
+      <w:proofErr w:type="gramStart"/>
+      <w:r>
+        <w:rPr>
+          <w:rFonts w:ascii="Consolas" w:hAnsi="Consolas"/>
+          <w:sz w:val="18"/>
+          <w:szCs w:val="18"/>
+          <w:lang w:val="en-PK"/>
+        </w:rPr>
+        <w:t>range(</w:t>
+      </w:r>
+      <w:proofErr w:type="gramEnd"/>
+      <w:r>
+        <w:rPr>
+          <w:rFonts w:ascii="Consolas" w:hAnsi="Consolas"/>
+          <w:sz w:val="18"/>
+          <w:szCs w:val="18"/>
+          <w:lang w:val="en-PK"/>
+        </w:rPr>
+        <w:t>)</w:t>
+      </w:r>
+      <w:r>
+        <w:rPr>
+          <w:sz w:val="18"/>
+          <w:szCs w:val="18"/>
+          <w:lang w:val="en-PK"/>
+        </w:rPr>
+        <w:t> </w:t>
+      </w:r>
+      <w:r>
+        <w:rPr>
+          <w:lang w:val="en-PK"/>
+        </w:rPr>
+        <w:t>function. As a result, all 357 rows were numbered from 1 to 357 with no skipped numbers.</w:t>
+      </w:r>
+    </w:p>
+    <w:p>
+      <w:pPr>
+        <w:numPr>
+          <w:ilvl w:val="0"/>
+          <w:numId w:val="4"/>
+        </w:numPr>
+        <w:spacing w:line="276" w:lineRule="auto"/>
+        <w:rPr>
+          <w:b/>
+          <w:bCs/>
+          <w:sz w:val="28"/>
+          <w:szCs w:val="28"/>
+          <w:lang w:val="en-PK"/>
+        </w:rPr>
+      </w:pPr>
+      <w:r>
+        <w:rPr>
+          <w:b/>
+          <w:bCs/>
+          <w:lang w:val="en-PK"/>
+        </w:rPr>
+        <w:t>Saved the cleaned dataset –</w:t>
+      </w:r>
+      <w:r>
+        <w:rPr>
+          <w:b/>
+          <w:bCs/>
+          <w:sz w:val="28"/>
+          <w:szCs w:val="28"/>
+          <w:lang w:val="en-PK"/>
+        </w:rPr>
+        <w:t xml:space="preserve"> </w:t>
+      </w:r>
+      <w:r>
+        <w:rPr>
+          <w:lang w:val="en-PK"/>
+        </w:rPr>
+        <w:t>Using </w:t>
+      </w:r>
+      <w:r>
+        <w:rPr>
+          <w:rFonts w:ascii="Consolas" w:hAnsi="Consolas"/>
+          <w:sz w:val="18"/>
+          <w:szCs w:val="18"/>
+          <w:lang w:val="en-PK"/>
+        </w:rPr>
+        <w:t>.</w:t>
+      </w:r>
+      <w:proofErr w:type="spellStart"/>
+      <w:r>
+        <w:rPr>
+          <w:rFonts w:ascii="Consolas" w:hAnsi="Consolas"/>
+          <w:sz w:val="18"/>
+          <w:szCs w:val="18"/>
+          <w:lang w:val="en-PK"/>
+        </w:rPr>
+        <w:t>to_</w:t>
+      </w:r>
+      <w:proofErr w:type="gramStart"/>
+      <w:r>
+        <w:rPr>
+          <w:rFonts w:ascii="Consolas" w:hAnsi="Consolas"/>
+          <w:sz w:val="18"/>
+          <w:szCs w:val="18"/>
+          <w:lang w:val="en-PK"/>
+        </w:rPr>
+        <w:t>csv</w:t>
+      </w:r>
+      <w:proofErr w:type="spellEnd"/>
+      <w:r>
+        <w:rPr>
+          <w:rFonts w:ascii="Consolas" w:hAnsi="Consolas"/>
+          <w:sz w:val="18"/>
+          <w:szCs w:val="18"/>
+          <w:lang w:val="en-PK"/>
+        </w:rPr>
+        <w:t>(</w:t>
+      </w:r>
+      <w:proofErr w:type="gramEnd"/>
+      <w:r>
+        <w:rPr>
+          <w:rFonts w:ascii="Consolas" w:hAnsi="Consolas"/>
+          <w:sz w:val="18"/>
+          <w:szCs w:val="18"/>
+          <w:lang w:val="en-PK"/>
+        </w:rPr>
+        <w:t>)</w:t>
+      </w:r>
+      <w:r>
+        <w:rPr>
+          <w:lang w:val="en-PK"/>
+        </w:rPr>
+        <w:t>, I exported the cleaned version of the dataset in CSV format.</w:t>
+      </w:r>
+    </w:p>
+    <w:p>
+      <w:pPr>
+        <w:spacing w:line="276" w:lineRule="auto"/>
+      </w:pPr>
     </w:p>
     <w:sectPr>
       <w:pgSz w:w="12240" w:h="15840"/>
@@ -908,6 +3713,297 @@
 <file path=word/numbering.xml><?xml version="1.0" encoding="utf-8"?>
 <w:numbering xmlns:wpc="http://schemas.microsoft.com/office/word/2010/wordprocessingCanvas" xmlns:cx="http://schemas.microsoft.com/office/drawing/2014/chartex" xmlns:cx1="http://schemas.microsoft.com/office/drawing/2015/9/8/chartex" xmlns:cx2="http://schemas.microsoft.com/office/drawing/2015/10/21/chartex" xmlns:cx3="http://schemas.microsoft.com/office/drawing/2016/5/9/chartex" xmlns:cx4="http://schemas.microsoft.com/office/drawing/2016/5/10/chartex" xmlns:cx5="http://schemas.microsoft.com/office/drawing/2016/5/11/chartex" xmlns:cx6="http://schemas.microsoft.com/office/drawing/2016/5/12/chartex" xmlns:cx7="http://schemas.microsoft.com/office/drawing/2016/5/13/chartex" xmlns:cx8="http://schemas.microsoft.com/office/drawing/2016/5/14/chartex" xmlns:mc="http://schemas.openxmlformats.org/markup-compatibility/2006" xmlns:aink="http://schemas.microsoft.com/office/drawing/2016/ink" xmlns:am3d="http://schemas.microsoft.com/office/drawing/2017/model3d" xmlns:o="urn:schemas-microsoft-com:office:office" xmlns:oel="http://schemas.microsoft.com/office/2019/extlst" xmlns:r="http://schemas.openxmlformats.org/officeDocument/2006/relationships" xmlns:m="http://schemas.openxmlformats.org/officeDocument/2006/math" xmlns:v="urn:schemas-microsoft-com:vml" xmlns:wp14="http://schemas.microsoft.com/office/word/2010/wordprocessingDrawing" xmlns:wp="http://schemas.openxmlformats.org/drawingml/2006/wordprocessingDrawing" xmlns:w10="urn:schemas-microsoft-com:office:word" xmlns:w="http://schemas.openxmlformats.org/wordprocessingml/2006/main" xmlns:w14="http://schemas.microsoft.com/office/word/2010/wordml" xmlns:w15="http://schemas.microsoft.com/office/word/2012/wordml" xmlns:w16cex="http://schemas.microsoft.com/office/word/2018/wordml/cex" xmlns:w16cid="http://schemas.microsoft.com/office/word/2016/wordml/cid" xmlns:w16="http://schemas.microsoft.com/office/word/2018/wordml" xmlns:w16du="http://schemas.microsoft.com/office/word/2023/wordml/word16du" xmlns:w16sdtdh="http://schemas.microsoft.com/office/word/2020/wordml/sdtdatahash" xmlns:w16sdtfl="http://schemas.microsoft.com/office/word/2024/wordml/sdtformatlock" xmlns:w16se="http://schemas.microsoft.com/office/word/2015/wordml/symex" xmlns:wpg="http://schemas.microsoft.com/office/word/2010/wordprocessingGroup" xmlns:wpi="http://schemas.microsoft.com/office/word/2010/wordprocessingInk" xmlns:wne="http://schemas.microsoft.com/office/word/2006/wordml" xmlns:wps="http://schemas.microsoft.com/office/word/2010/wordprocessingShape" mc:Ignorable="w14 w15 w16se w16cid w16 w16cex w16sdtdh w16sdtfl w16du wp14">
   <w:abstractNum w:abstractNumId="0" w15:restartNumberingAfterBreak="0">
+    <w:nsid w:val="32A76D9C"/>
+    <w:multiLevelType w:val="multilevel"/>
+    <w:tmpl w:val="0BB81726"/>
+    <w:lvl w:ilvl="0">
+      <w:start w:val="1"/>
+      <w:numFmt w:val="decimal"/>
+      <w:lvlText w:val="%1."/>
+      <w:lvlJc w:val="left"/>
+      <w:pPr>
+        <w:tabs>
+          <w:tab w:val="num" w:pos="720"/>
+        </w:tabs>
+        <w:ind w:left="720" w:hanging="360"/>
+      </w:pPr>
+      <w:rPr>
+        <w:b w:val="0"/>
+        <w:bCs w:val="0"/>
+        <w:sz w:val="22"/>
+        <w:szCs w:val="22"/>
+      </w:rPr>
+    </w:lvl>
+    <w:lvl w:ilvl="1" w:tentative="1">
+      <w:start w:val="1"/>
+      <w:numFmt w:val="decimal"/>
+      <w:lvlText w:val="%2."/>
+      <w:lvlJc w:val="left"/>
+      <w:pPr>
+        <w:tabs>
+          <w:tab w:val="num" w:pos="1440"/>
+        </w:tabs>
+        <w:ind w:left="1440" w:hanging="360"/>
+      </w:pPr>
+    </w:lvl>
+    <w:lvl w:ilvl="2" w:tentative="1">
+      <w:start w:val="1"/>
+      <w:numFmt w:val="decimal"/>
+      <w:lvlText w:val="%3."/>
+      <w:lvlJc w:val="left"/>
+      <w:pPr>
+        <w:tabs>
+          <w:tab w:val="num" w:pos="2160"/>
+        </w:tabs>
+        <w:ind w:left="2160" w:hanging="360"/>
+      </w:pPr>
+    </w:lvl>
+    <w:lvl w:ilvl="3" w:tentative="1">
+      <w:start w:val="1"/>
+      <w:numFmt w:val="decimal"/>
+      <w:lvlText w:val="%4."/>
+      <w:lvlJc w:val="left"/>
+      <w:pPr>
+        <w:tabs>
+          <w:tab w:val="num" w:pos="2880"/>
+        </w:tabs>
+        <w:ind w:left="2880" w:hanging="360"/>
+      </w:pPr>
+    </w:lvl>
+    <w:lvl w:ilvl="4" w:tentative="1">
+      <w:start w:val="1"/>
+      <w:numFmt w:val="decimal"/>
+      <w:lvlText w:val="%5."/>
+      <w:lvlJc w:val="left"/>
+      <w:pPr>
+        <w:tabs>
+          <w:tab w:val="num" w:pos="3600"/>
+        </w:tabs>
+        <w:ind w:left="3600" w:hanging="360"/>
+      </w:pPr>
+    </w:lvl>
+    <w:lvl w:ilvl="5" w:tentative="1">
+      <w:start w:val="1"/>
+      <w:numFmt w:val="decimal"/>
+      <w:lvlText w:val="%6."/>
+      <w:lvlJc w:val="left"/>
+      <w:pPr>
+        <w:tabs>
+          <w:tab w:val="num" w:pos="4320"/>
+        </w:tabs>
+        <w:ind w:left="4320" w:hanging="360"/>
+      </w:pPr>
+    </w:lvl>
+    <w:lvl w:ilvl="6" w:tentative="1">
+      <w:start w:val="1"/>
+      <w:numFmt w:val="decimal"/>
+      <w:lvlText w:val="%7."/>
+      <w:lvlJc w:val="left"/>
+      <w:pPr>
+        <w:tabs>
+          <w:tab w:val="num" w:pos="5040"/>
+        </w:tabs>
+        <w:ind w:left="5040" w:hanging="360"/>
+      </w:pPr>
+    </w:lvl>
+    <w:lvl w:ilvl="7" w:tentative="1">
+      <w:start w:val="1"/>
+      <w:numFmt w:val="decimal"/>
+      <w:lvlText w:val="%8."/>
+      <w:lvlJc w:val="left"/>
+      <w:pPr>
+        <w:tabs>
+          <w:tab w:val="num" w:pos="5760"/>
+        </w:tabs>
+        <w:ind w:left="5760" w:hanging="360"/>
+      </w:pPr>
+    </w:lvl>
+    <w:lvl w:ilvl="8" w:tentative="1">
+      <w:start w:val="1"/>
+      <w:numFmt w:val="decimal"/>
+      <w:lvlText w:val="%9."/>
+      <w:lvlJc w:val="left"/>
+      <w:pPr>
+        <w:tabs>
+          <w:tab w:val="num" w:pos="6480"/>
+        </w:tabs>
+        <w:ind w:left="6480" w:hanging="360"/>
+      </w:pPr>
+    </w:lvl>
+  </w:abstractNum>
+  <w:abstractNum w:abstractNumId="1" w15:restartNumberingAfterBreak="0">
+    <w:nsid w:val="3CBA6FD3"/>
+    <w:multiLevelType w:val="hybridMultilevel"/>
+    <w:tmpl w:val="8AE63068"/>
+    <w:lvl w:ilvl="0" w:tplc="2000000F">
+      <w:start w:val="1"/>
+      <w:numFmt w:val="decimal"/>
+      <w:lvlText w:val="%1."/>
+      <w:lvlJc w:val="left"/>
+      <w:pPr>
+        <w:ind w:left="720" w:hanging="360"/>
+      </w:pPr>
+    </w:lvl>
+    <w:lvl w:ilvl="1" w:tplc="20000019" w:tentative="1">
+      <w:start w:val="1"/>
+      <w:numFmt w:val="lowerLetter"/>
+      <w:lvlText w:val="%2."/>
+      <w:lvlJc w:val="left"/>
+      <w:pPr>
+        <w:ind w:left="1440" w:hanging="360"/>
+      </w:pPr>
+    </w:lvl>
+    <w:lvl w:ilvl="2" w:tplc="2000001B" w:tentative="1">
+      <w:start w:val="1"/>
+      <w:numFmt w:val="lowerRoman"/>
+      <w:lvlText w:val="%3."/>
+      <w:lvlJc w:val="right"/>
+      <w:pPr>
+        <w:ind w:left="2160" w:hanging="180"/>
+      </w:pPr>
+    </w:lvl>
+    <w:lvl w:ilvl="3" w:tplc="2000000F" w:tentative="1">
+      <w:start w:val="1"/>
+      <w:numFmt w:val="decimal"/>
+      <w:lvlText w:val="%4."/>
+      <w:lvlJc w:val="left"/>
+      <w:pPr>
+        <w:ind w:left="2880" w:hanging="360"/>
+      </w:pPr>
+    </w:lvl>
+    <w:lvl w:ilvl="4" w:tplc="20000019" w:tentative="1">
+      <w:start w:val="1"/>
+      <w:numFmt w:val="lowerLetter"/>
+      <w:lvlText w:val="%5."/>
+      <w:lvlJc w:val="left"/>
+      <w:pPr>
+        <w:ind w:left="3600" w:hanging="360"/>
+      </w:pPr>
+    </w:lvl>
+    <w:lvl w:ilvl="5" w:tplc="2000001B" w:tentative="1">
+      <w:start w:val="1"/>
+      <w:numFmt w:val="lowerRoman"/>
+      <w:lvlText w:val="%6."/>
+      <w:lvlJc w:val="right"/>
+      <w:pPr>
+        <w:ind w:left="4320" w:hanging="180"/>
+      </w:pPr>
+    </w:lvl>
+    <w:lvl w:ilvl="6" w:tplc="2000000F" w:tentative="1">
+      <w:start w:val="1"/>
+      <w:numFmt w:val="decimal"/>
+      <w:lvlText w:val="%7."/>
+      <w:lvlJc w:val="left"/>
+      <w:pPr>
+        <w:ind w:left="5040" w:hanging="360"/>
+      </w:pPr>
+    </w:lvl>
+    <w:lvl w:ilvl="7" w:tplc="20000019" w:tentative="1">
+      <w:start w:val="1"/>
+      <w:numFmt w:val="lowerLetter"/>
+      <w:lvlText w:val="%8."/>
+      <w:lvlJc w:val="left"/>
+      <w:pPr>
+        <w:ind w:left="5760" w:hanging="360"/>
+      </w:pPr>
+    </w:lvl>
+    <w:lvl w:ilvl="8" w:tplc="2000001B" w:tentative="1">
+      <w:start w:val="1"/>
+      <w:numFmt w:val="lowerRoman"/>
+      <w:lvlText w:val="%9."/>
+      <w:lvlJc w:val="right"/>
+      <w:pPr>
+        <w:ind w:left="6480" w:hanging="180"/>
+      </w:pPr>
+    </w:lvl>
+  </w:abstractNum>
+  <w:abstractNum w:abstractNumId="2" w15:restartNumberingAfterBreak="0">
+    <w:nsid w:val="3FBB19FA"/>
+    <w:multiLevelType w:val="hybridMultilevel"/>
+    <w:tmpl w:val="7E82A088"/>
+    <w:lvl w:ilvl="0" w:tplc="2000000F">
+      <w:start w:val="1"/>
+      <w:numFmt w:val="decimal"/>
+      <w:lvlText w:val="%1."/>
+      <w:lvlJc w:val="left"/>
+      <w:pPr>
+        <w:ind w:left="720" w:hanging="360"/>
+      </w:pPr>
+    </w:lvl>
+    <w:lvl w:ilvl="1" w:tplc="20000019" w:tentative="1">
+      <w:start w:val="1"/>
+      <w:numFmt w:val="lowerLetter"/>
+      <w:lvlText w:val="%2."/>
+      <w:lvlJc w:val="left"/>
+      <w:pPr>
+        <w:ind w:left="1440" w:hanging="360"/>
+      </w:pPr>
+    </w:lvl>
+    <w:lvl w:ilvl="2" w:tplc="2000001B" w:tentative="1">
+      <w:start w:val="1"/>
+      <w:numFmt w:val="lowerRoman"/>
+      <w:lvlText w:val="%3."/>
+      <w:lvlJc w:val="right"/>
+      <w:pPr>
+        <w:ind w:left="2160" w:hanging="180"/>
+      </w:pPr>
+    </w:lvl>
+    <w:lvl w:ilvl="3" w:tplc="2000000F" w:tentative="1">
+      <w:start w:val="1"/>
+      <w:numFmt w:val="decimal"/>
+      <w:lvlText w:val="%4."/>
+      <w:lvlJc w:val="left"/>
+      <w:pPr>
+        <w:ind w:left="2880" w:hanging="360"/>
+      </w:pPr>
+    </w:lvl>
+    <w:lvl w:ilvl="4" w:tplc="20000019" w:tentative="1">
+      <w:start w:val="1"/>
+      <w:numFmt w:val="lowerLetter"/>
+      <w:lvlText w:val="%5."/>
+      <w:lvlJc w:val="left"/>
+      <w:pPr>
+        <w:ind w:left="3600" w:hanging="360"/>
+      </w:pPr>
+    </w:lvl>
+    <w:lvl w:ilvl="5" w:tplc="2000001B" w:tentative="1">
+      <w:start w:val="1"/>
+      <w:numFmt w:val="lowerRoman"/>
+      <w:lvlText w:val="%6."/>
+      <w:lvlJc w:val="right"/>
+      <w:pPr>
+        <w:ind w:left="4320" w:hanging="180"/>
+      </w:pPr>
+    </w:lvl>
+    <w:lvl w:ilvl="6" w:tplc="2000000F" w:tentative="1">
+      <w:start w:val="1"/>
+      <w:numFmt w:val="decimal"/>
+      <w:lvlText w:val="%7."/>
+      <w:lvlJc w:val="left"/>
+      <w:pPr>
+        <w:ind w:left="5040" w:hanging="360"/>
+      </w:pPr>
+    </w:lvl>
+    <w:lvl w:ilvl="7" w:tplc="20000019" w:tentative="1">
+      <w:start w:val="1"/>
+      <w:numFmt w:val="lowerLetter"/>
+      <w:lvlText w:val="%8."/>
+      <w:lvlJc w:val="left"/>
+      <w:pPr>
+        <w:ind w:left="5760" w:hanging="360"/>
+      </w:pPr>
+    </w:lvl>
+    <w:lvl w:ilvl="8" w:tplc="2000001B" w:tentative="1">
+      <w:start w:val="1"/>
+      <w:numFmt w:val="lowerRoman"/>
+      <w:lvlText w:val="%9."/>
+      <w:lvlJc w:val="right"/>
+      <w:pPr>
+        <w:ind w:left="6480" w:hanging="180"/>
+      </w:pPr>
+    </w:lvl>
+  </w:abstractNum>
+  <w:abstractNum w:abstractNumId="3" w15:restartNumberingAfterBreak="0">
     <w:nsid w:val="4EB71398"/>
     <w:multiLevelType w:val="hybridMultilevel"/>
     <w:tmpl w:val="B184B5BE"/>
@@ -994,6 +4090,15 @@
     </w:lvl>
   </w:abstractNum>
   <w:num w:numId="1" w16cid:durableId="722214278">
+    <w:abstractNumId w:val="3"/>
+  </w:num>
+  <w:num w:numId="2" w16cid:durableId="1042485920">
+    <w:abstractNumId w:val="1"/>
+  </w:num>
+  <w:num w:numId="3" w16cid:durableId="1235628346">
+    <w:abstractNumId w:val="2"/>
+  </w:num>
+  <w:num w:numId="4" w16cid:durableId="658270697">
     <w:abstractNumId w:val="0"/>
   </w:num>
 </w:numbering>
@@ -1602,7 +4707,6 @@
   <w:style w:type="character" w:default="1" w:styleId="DefaultParagraphFont">
     <w:name w:val="Default Paragraph Font"/>
     <w:uiPriority w:val="1"/>
-    <w:semiHidden/>
     <w:unhideWhenUsed/>
   </w:style>
   <w:style w:type="table" w:default="1" w:styleId="TableNormal">
@@ -1916,6 +5020,36 @@
       <w:spacing w:val="5"/>
     </w:rPr>
   </w:style>
+  <w:style w:type="paragraph" w:styleId="HTMLPreformatted">
+    <w:name w:val="HTML Preformatted"/>
+    <w:basedOn w:val="Normal"/>
+    <w:link w:val="HTMLPreformattedChar"/>
+    <w:uiPriority w:val="99"/>
+    <w:semiHidden/>
+    <w:unhideWhenUsed/>
+    <w:rsid w:val="00491BCA"/>
+    <w:pPr>
+      <w:spacing w:after="0" w:line="240" w:lineRule="auto"/>
+    </w:pPr>
+    <w:rPr>
+      <w:rFonts w:ascii="Consolas" w:hAnsi="Consolas"/>
+      <w:sz w:val="20"/>
+      <w:szCs w:val="20"/>
+    </w:rPr>
+  </w:style>
+  <w:style w:type="character" w:customStyle="1" w:styleId="HTMLPreformattedChar">
+    <w:name w:val="HTML Preformatted Char"/>
+    <w:basedOn w:val="DefaultParagraphFont"/>
+    <w:link w:val="HTMLPreformatted"/>
+    <w:uiPriority w:val="99"/>
+    <w:semiHidden/>
+    <w:rsid w:val="00491BCA"/>
+    <w:rPr>
+      <w:rFonts w:ascii="Consolas" w:hAnsi="Consolas"/>
+      <w:sz w:val="20"/>
+      <w:szCs w:val="20"/>
+    </w:rPr>
+  </w:style>
 </w:styles>
 </file>
 

</xml_diff>